<commit_message>
Fix Excel save for Streamlit cloud
</commit_message>
<xml_diff>
--- a/sa.docx
+++ b/sa.docx
@@ -148,12 +148,12 @@
     </w:p>
     <w:p>
       <w:r>
-        <w:t xml:space="preserve">        "1": {"Inner": (5.90, 5.50, 6.40)},</w:t>
-      </w:r>
-    </w:p>
-    <w:p>
-      <w:r>
-        <w:t xml:space="preserve">        "2": {"Inner": (6.15, 5.65, 6.65)},</w:t>
+        <w:t xml:space="preserve">        "1": {"Inner": (6.00, 5.50, 6.50)},</w:t>
+      </w:r>
+    </w:p>
+    <w:p>
+      <w:r>
+        <w:t xml:space="preserve">        "2": {"Inner": (6.00, 5.50, 6.50)},</w:t>
       </w:r>
     </w:p>
     <w:p>
@@ -163,12 +163,12 @@
     </w:p>
     <w:p>
       <w:r>
-        <w:t xml:space="preserve">        "4": {"Inner": (6.30, 5.80, 6.80)},</w:t>
-      </w:r>
-    </w:p>
-    <w:p>
-      <w:r>
-        <w:t xml:space="preserve">        "5": {"Inner": (6.10, 5.60, 6.60)},</w:t>
+        <w:t xml:space="preserve">        "4": {"Inner": (6.00, 5.50, 6.50)},</w:t>
+      </w:r>
+    </w:p>
+    <w:p>
+      <w:r>
+        <w:t xml:space="preserve">        "5": {"Inner": (6.00, 5.50, 6.50)},</w:t>
       </w:r>
     </w:p>
     <w:p>
@@ -189,7 +189,7 @@
     </w:p>
     <w:p>
       <w:r>
-        <w:t xml:space="preserve">    "Timestamp", "Machine", "Part Type", "Chamber", "Piece ID", "Part In/Out",</w:t>
+        <w:t xml:space="preserve">    "Timestamp","Measured Date", "Machine", "Part Type", "Chamber", "Piece ID", "Part In/Out", "Batch Cleaning",</w:t>
       </w:r>
     </w:p>
     <w:p>
@@ -236,43 +236,319 @@
     </w:p>
     <w:p>
       <w:r>
+        <w:lastRenderedPageBreak/>
         <w:t xml:space="preserve">    try:</w:t>
       </w:r>
     </w:p>
     <w:p>
       <w:r>
+        <w:t xml:space="preserve">        with pd.ExcelWriter(tmp, engine="openpyxl") as w:</w:t>
+      </w:r>
+    </w:p>
+    <w:p>
+      <w:r>
+        <w:t xml:space="preserve">            for sheet_name, df in sheets_dict.items():</w:t>
+      </w:r>
+    </w:p>
+    <w:p>
+      <w:r>
+        <w:t xml:space="preserve">                df.to_excel(w, sheet_name=sheet_name, index=False)</w:t>
+      </w:r>
+    </w:p>
+    <w:p>
+      <w:r>
+        <w:t xml:space="preserve">        os.replace(tmp, filename)</w:t>
+      </w:r>
+    </w:p>
+    <w:p>
+      <w:r>
+        <w:t xml:space="preserve">        return filename, None</w:t>
+      </w:r>
+    </w:p>
+    <w:p>
+      <w:r>
+        <w:t xml:space="preserve">    except PermissionError:</w:t>
+      </w:r>
+    </w:p>
+    <w:p>
+      <w:r>
+        <w:t xml:space="preserve">        try: os.remove(tmp)</w:t>
+      </w:r>
+    </w:p>
+    <w:p>
+      <w:r>
+        <w:t xml:space="preserve">        except: pass</w:t>
+      </w:r>
+    </w:p>
+    <w:p>
+      <w:r>
+        <w:t xml:space="preserve">        alt = f"{os.path.splitext(filename)[0]}_LOCKED_{datetime.now().strftime('%Y%m%d%H%M%S')}.xlsx"</w:t>
+      </w:r>
+    </w:p>
+    <w:p>
+      <w:r>
+        <w:t xml:space="preserve">        try:</w:t>
+      </w:r>
+    </w:p>
+    <w:p>
+      <w:r>
+        <w:t xml:space="preserve">            with pd.ExcelWriter(alt, engine="openpyxl") as w:</w:t>
+      </w:r>
+    </w:p>
+    <w:p>
+      <w:r>
+        <w:t xml:space="preserve">                for sheet_name, df in sheets_dict.items():</w:t>
+      </w:r>
+    </w:p>
+    <w:p>
+      <w:r>
+        <w:t xml:space="preserve">                    df.to_excel(w, sheet_name=sheet_name, index=False)</w:t>
+      </w:r>
+    </w:p>
+    <w:p>
+      <w:r>
+        <w:t xml:space="preserve">            return None, alt</w:t>
+      </w:r>
+    </w:p>
+    <w:p>
+      <w:r>
+        <w:t xml:space="preserve">        except Exception:</w:t>
+      </w:r>
+    </w:p>
+    <w:p>
+      <w:r>
+        <w:t xml:space="preserve">            try: os.remove(alt)</w:t>
+      </w:r>
+    </w:p>
+    <w:p>
+      <w:r>
+        <w:t xml:space="preserve">            except: pass</w:t>
+      </w:r>
+    </w:p>
+    <w:p>
+      <w:r>
+        <w:t xml:space="preserve">            return None, None</w:t>
+      </w:r>
+    </w:p>
+    <w:p>
+      <w:r>
+        <w:t xml:space="preserve">    except Exception:</w:t>
+      </w:r>
+    </w:p>
+    <w:p>
+      <w:r>
+        <w:t xml:space="preserve">        try: os.remove(tmp)</w:t>
+      </w:r>
+    </w:p>
+    <w:p>
+      <w:r>
+        <w:t xml:space="preserve">        except: pass</w:t>
+      </w:r>
+    </w:p>
+    <w:p>
+      <w:r>
+        <w:t xml:space="preserve">        return None, None</w:t>
+      </w:r>
+    </w:p>
+    <w:p/>
+    <w:p>
+      <w:r>
+        <w:t>def read_sheet_safe(sheet_name):</w:t>
+      </w:r>
+    </w:p>
+    <w:p>
+      <w:r>
         <w:lastRenderedPageBreak/>
-        <w:t xml:space="preserve">        with pd.ExcelWriter(tmp, engine="openpyxl") as w:</w:t>
-      </w:r>
-    </w:p>
-    <w:p>
-      <w:r>
-        <w:t xml:space="preserve">            for sheet_name, df in sheets_dict.items():</w:t>
-      </w:r>
-    </w:p>
-    <w:p>
-      <w:r>
-        <w:t xml:space="preserve">                df.to_excel(w, sheet_name=sheet_name, index=False)</w:t>
-      </w:r>
-    </w:p>
-    <w:p>
-      <w:r>
-        <w:t xml:space="preserve">        os.replace(tmp, filename)</w:t>
-      </w:r>
-    </w:p>
-    <w:p>
-      <w:r>
-        <w:t xml:space="preserve">        return filename, None</w:t>
-      </w:r>
-    </w:p>
-    <w:p>
-      <w:r>
-        <w:t xml:space="preserve">    except PermissionError:</w:t>
-      </w:r>
-    </w:p>
-    <w:p>
-      <w:r>
-        <w:t xml:space="preserve">        try: os.remove(tmp)</w:t>
+        <w:t xml:space="preserve">    if not os.path.exists(EXCEL):</w:t>
+      </w:r>
+    </w:p>
+    <w:p>
+      <w:r>
+        <w:t xml:space="preserve">        return pd.DataFrame(columns=DATA_COLS if sheet_name != SHEET_SPECS else SPECS_COLS)</w:t>
+      </w:r>
+    </w:p>
+    <w:p>
+      <w:r>
+        <w:t xml:space="preserve">    try:</w:t>
+      </w:r>
+    </w:p>
+    <w:p>
+      <w:r>
+        <w:t xml:space="preserve">        return pd.read_excel(EXCEL, sheet_name=sheet_name)</w:t>
+      </w:r>
+    </w:p>
+    <w:p>
+      <w:r>
+        <w:t xml:space="preserve">    except Exception:</w:t>
+      </w:r>
+    </w:p>
+    <w:p>
+      <w:r>
+        <w:t xml:space="preserve">        return pd.DataFrame(columns=DATA_COLS if sheet_name != SHEET_SPECS else SPECS_COLS)</w:t>
+      </w:r>
+    </w:p>
+    <w:p/>
+    <w:p>
+      <w:r>
+        <w:t>def build_specs_df():</w:t>
+      </w:r>
+    </w:p>
+    <w:p>
+      <w:r>
+        <w:t xml:space="preserve">    rows = []</w:t>
+      </w:r>
+    </w:p>
+    <w:p>
+      <w:r>
+        <w:t xml:space="preserve">    for part, holes in SPECS.items():</w:t>
+      </w:r>
+    </w:p>
+    <w:p>
+      <w:r>
+        <w:t xml:space="preserve">        for hole, feats in holes.items():</w:t>
+      </w:r>
+    </w:p>
+    <w:p>
+      <w:r>
+        <w:t xml:space="preserve">            for feat, (nom, lsl, usl) in feats.items():</w:t>
+      </w:r>
+    </w:p>
+    <w:p>
+      <w:r>
+        <w:t xml:space="preserve">                rows.append({</w:t>
+      </w:r>
+    </w:p>
+    <w:p>
+      <w:r>
+        <w:t xml:space="preserve">                    "Part Type": part,</w:t>
+      </w:r>
+    </w:p>
+    <w:p>
+      <w:r>
+        <w:t xml:space="preserve">                    "Hole": f"H{hole}",</w:t>
+      </w:r>
+    </w:p>
+    <w:p>
+      <w:r>
+        <w:t xml:space="preserve">                    "Feature": feat,</w:t>
+      </w:r>
+    </w:p>
+    <w:p>
+      <w:r>
+        <w:t xml:space="preserve">                    "Nominal": nom,</w:t>
+      </w:r>
+    </w:p>
+    <w:p>
+      <w:r>
+        <w:t xml:space="preserve">                    "LSL": lsl,</w:t>
+      </w:r>
+    </w:p>
+    <w:p>
+      <w:r>
+        <w:t xml:space="preserve">                    "USL": usl,</w:t>
+      </w:r>
+    </w:p>
+    <w:p>
+      <w:r>
+        <w:t xml:space="preserve">                    "Tolerance": round(nom - lsl, 4)</w:t>
+      </w:r>
+    </w:p>
+    <w:p>
+      <w:r>
+        <w:t xml:space="preserve">                })</w:t>
+      </w:r>
+    </w:p>
+    <w:p>
+      <w:r>
+        <w:t xml:space="preserve">    return pd.DataFrame(rows, columns=SPECS_COLS)</w:t>
+      </w:r>
+    </w:p>
+    <w:p/>
+    <w:p>
+      <w:r>
+        <w:t>def ensure_workbook():</w:t>
+      </w:r>
+    </w:p>
+    <w:p>
+      <w:r>
+        <w:t xml:space="preserve">    if not os.path.exists(EXCEL):</w:t>
+      </w:r>
+    </w:p>
+    <w:p>
+      <w:r>
+        <w:lastRenderedPageBreak/>
+        <w:t xml:space="preserve">        sheets = {</w:t>
+      </w:r>
+    </w:p>
+    <w:p>
+      <w:r>
+        <w:t xml:space="preserve">            SHEET_MB: pd.DataFrame(columns=DATA_COLS),</w:t>
+      </w:r>
+    </w:p>
+    <w:p>
+      <w:r>
+        <w:t xml:space="preserve">            SHEET_GW: pd.DataFrame(columns=DATA_COLS),</w:t>
+      </w:r>
+    </w:p>
+    <w:p>
+      <w:r>
+        <w:t xml:space="preserve">            SHEET_SPECS: build_specs_df(),</w:t>
+      </w:r>
+    </w:p>
+    <w:p>
+      <w:r>
+        <w:t xml:space="preserve">            SHEET_GW_REF: pd.DataFrame(["Image Loads Below"])</w:t>
+      </w:r>
+    </w:p>
+    <w:p>
+      <w:r>
+        <w:t xml:space="preserve">        }</w:t>
+      </w:r>
+    </w:p>
+    <w:p>
+      <w:r>
+        <w:t xml:space="preserve">        saved, alt = atomic_write_all(EXCEL, sheets)</w:t>
+      </w:r>
+    </w:p>
+    <w:p>
+      <w:r>
+        <w:t xml:space="preserve">        if saved:</w:t>
+      </w:r>
+    </w:p>
+    <w:p>
+      <w:r>
+        <w:t xml:space="preserve">            try: add_reference_image()</w:t>
+      </w:r>
+    </w:p>
+    <w:p>
+      <w:r>
+        <w:t xml:space="preserve">            except: pass</w:t>
+      </w:r>
+    </w:p>
+    <w:p>
+      <w:r>
+        <w:t xml:space="preserve">        return</w:t>
+      </w:r>
+    </w:p>
+    <w:p/>
+    <w:p>
+      <w:r>
+        <w:t xml:space="preserve">    try:</w:t>
+      </w:r>
+    </w:p>
+    <w:p>
+      <w:r>
+        <w:t xml:space="preserve">        all_sheets = pd.read_excel(EXCEL, sheet_name=None)</w:t>
+      </w:r>
+    </w:p>
+    <w:p>
+      <w:r>
+        <w:t xml:space="preserve">    except Exception:</w:t>
+      </w:r>
+    </w:p>
+    <w:p>
+      <w:r>
+        <w:t xml:space="preserve">        try: os.remove(EXCEL)</w:t>
       </w:r>
     </w:p>
     <w:p>
@@ -282,282 +558,6 @@
     </w:p>
     <w:p>
       <w:r>
-        <w:t xml:space="preserve">        alt = f"{os.path.splitext(filename)[0]}_LOCKED_{datetime.now().strftime('%Y%m%d%H%M%S')}.xlsx"</w:t>
-      </w:r>
-    </w:p>
-    <w:p>
-      <w:r>
-        <w:t xml:space="preserve">        try:</w:t>
-      </w:r>
-    </w:p>
-    <w:p>
-      <w:r>
-        <w:t xml:space="preserve">            with pd.ExcelWriter(alt, engine="openpyxl") as w:</w:t>
-      </w:r>
-    </w:p>
-    <w:p>
-      <w:r>
-        <w:t xml:space="preserve">                for sheet_name, df in sheets_dict.items():</w:t>
-      </w:r>
-    </w:p>
-    <w:p>
-      <w:r>
-        <w:t xml:space="preserve">                    df.to_excel(w, sheet_name=sheet_name, index=False)</w:t>
-      </w:r>
-    </w:p>
-    <w:p>
-      <w:r>
-        <w:t xml:space="preserve">            return None, alt</w:t>
-      </w:r>
-    </w:p>
-    <w:p>
-      <w:r>
-        <w:t xml:space="preserve">        except Exception:</w:t>
-      </w:r>
-    </w:p>
-    <w:p>
-      <w:r>
-        <w:t xml:space="preserve">            try: os.remove(alt)</w:t>
-      </w:r>
-    </w:p>
-    <w:p>
-      <w:r>
-        <w:t xml:space="preserve">            except: pass</w:t>
-      </w:r>
-    </w:p>
-    <w:p>
-      <w:r>
-        <w:t xml:space="preserve">            return None, None</w:t>
-      </w:r>
-    </w:p>
-    <w:p>
-      <w:r>
-        <w:t xml:space="preserve">    except Exception:</w:t>
-      </w:r>
-    </w:p>
-    <w:p>
-      <w:r>
-        <w:t xml:space="preserve">        try: os.remove(tmp)</w:t>
-      </w:r>
-    </w:p>
-    <w:p>
-      <w:r>
-        <w:t xml:space="preserve">        except: pass</w:t>
-      </w:r>
-    </w:p>
-    <w:p>
-      <w:r>
-        <w:t xml:space="preserve">        return None, None</w:t>
-      </w:r>
-    </w:p>
-    <w:p/>
-    <w:p>
-      <w:r>
-        <w:t>def read_sheet_safe(sheet_name):</w:t>
-      </w:r>
-    </w:p>
-    <w:p>
-      <w:r>
-        <w:t xml:space="preserve">    if not os.path.exists(EXCEL):</w:t>
-      </w:r>
-    </w:p>
-    <w:p>
-      <w:r>
-        <w:lastRenderedPageBreak/>
-        <w:t xml:space="preserve">        return pd.DataFrame(columns=DATA_COLS if sheet_name != SHEET_SPECS else SPECS_COLS)</w:t>
-      </w:r>
-    </w:p>
-    <w:p>
-      <w:r>
-        <w:t xml:space="preserve">    try:</w:t>
-      </w:r>
-    </w:p>
-    <w:p>
-      <w:r>
-        <w:t xml:space="preserve">        return pd.read_excel(EXCEL, sheet_name=sheet_name)</w:t>
-      </w:r>
-    </w:p>
-    <w:p>
-      <w:r>
-        <w:t xml:space="preserve">    except Exception:</w:t>
-      </w:r>
-    </w:p>
-    <w:p>
-      <w:r>
-        <w:t xml:space="preserve">        return pd.DataFrame(columns=DATA_COLS if sheet_name != SHEET_SPECS else SPECS_COLS)</w:t>
-      </w:r>
-    </w:p>
-    <w:p/>
-    <w:p>
-      <w:r>
-        <w:t>def build_specs_df():</w:t>
-      </w:r>
-    </w:p>
-    <w:p>
-      <w:r>
-        <w:t xml:space="preserve">    rows = []</w:t>
-      </w:r>
-    </w:p>
-    <w:p>
-      <w:r>
-        <w:t xml:space="preserve">    for part, holes in SPECS.items():</w:t>
-      </w:r>
-    </w:p>
-    <w:p>
-      <w:r>
-        <w:t xml:space="preserve">        for hole, feats in holes.items():</w:t>
-      </w:r>
-    </w:p>
-    <w:p>
-      <w:r>
-        <w:t xml:space="preserve">            for feat, (nom, lsl, usl) in feats.items():</w:t>
-      </w:r>
-    </w:p>
-    <w:p>
-      <w:r>
-        <w:t xml:space="preserve">                rows.append({</w:t>
-      </w:r>
-    </w:p>
-    <w:p>
-      <w:r>
-        <w:t xml:space="preserve">                    "Part Type": part,</w:t>
-      </w:r>
-    </w:p>
-    <w:p>
-      <w:r>
-        <w:t xml:space="preserve">                    "Hole": f"H{hole}",</w:t>
-      </w:r>
-    </w:p>
-    <w:p>
-      <w:r>
-        <w:t xml:space="preserve">                    "Feature": feat,</w:t>
-      </w:r>
-    </w:p>
-    <w:p>
-      <w:r>
-        <w:t xml:space="preserve">                    "Nominal": nom,</w:t>
-      </w:r>
-    </w:p>
-    <w:p>
-      <w:r>
-        <w:t xml:space="preserve">                    "LSL": lsl,</w:t>
-      </w:r>
-    </w:p>
-    <w:p>
-      <w:r>
-        <w:t xml:space="preserve">                    "USL": usl,</w:t>
-      </w:r>
-    </w:p>
-    <w:p>
-      <w:r>
-        <w:t xml:space="preserve">                    "Tolerance": round(nom - lsl, 4)</w:t>
-      </w:r>
-    </w:p>
-    <w:p>
-      <w:r>
-        <w:t xml:space="preserve">                })</w:t>
-      </w:r>
-    </w:p>
-    <w:p>
-      <w:r>
-        <w:t xml:space="preserve">    return pd.DataFrame(rows, columns=SPECS_COLS)</w:t>
-      </w:r>
-    </w:p>
-    <w:p/>
-    <w:p>
-      <w:r>
-        <w:t>def ensure_workbook():</w:t>
-      </w:r>
-    </w:p>
-    <w:p>
-      <w:r>
-        <w:t xml:space="preserve">    if not os.path.exists(EXCEL):</w:t>
-      </w:r>
-    </w:p>
-    <w:p>
-      <w:r>
-        <w:t xml:space="preserve">        sheets = {</w:t>
-      </w:r>
-    </w:p>
-    <w:p>
-      <w:r>
-        <w:lastRenderedPageBreak/>
-        <w:t xml:space="preserve">            SHEET_MB: pd.DataFrame(columns=DATA_COLS),</w:t>
-      </w:r>
-    </w:p>
-    <w:p>
-      <w:r>
-        <w:t xml:space="preserve">            SHEET_GW: pd.DataFrame(columns=DATA_COLS),</w:t>
-      </w:r>
-    </w:p>
-    <w:p>
-      <w:r>
-        <w:t xml:space="preserve">            SHEET_SPECS: build_specs_df(),</w:t>
-      </w:r>
-    </w:p>
-    <w:p>
-      <w:r>
-        <w:t xml:space="preserve">            SHEET_GW_REF: pd.DataFrame(["Image Loads Below"])</w:t>
-      </w:r>
-    </w:p>
-    <w:p>
-      <w:r>
-        <w:t xml:space="preserve">        }</w:t>
-      </w:r>
-    </w:p>
-    <w:p>
-      <w:r>
-        <w:t xml:space="preserve">        saved, alt = atomic_write_all(EXCEL, sheets)</w:t>
-      </w:r>
-    </w:p>
-    <w:p>
-      <w:r>
-        <w:t xml:space="preserve">        if saved:</w:t>
-      </w:r>
-    </w:p>
-    <w:p>
-      <w:r>
-        <w:t xml:space="preserve">            try: add_reference_image()</w:t>
-      </w:r>
-    </w:p>
-    <w:p>
-      <w:r>
-        <w:t xml:space="preserve">            except: pass</w:t>
-      </w:r>
-    </w:p>
-    <w:p>
-      <w:r>
-        <w:t xml:space="preserve">        return</w:t>
-      </w:r>
-    </w:p>
-    <w:p/>
-    <w:p>
-      <w:r>
-        <w:t xml:space="preserve">    try:</w:t>
-      </w:r>
-    </w:p>
-    <w:p>
-      <w:r>
-        <w:t xml:space="preserve">        all_sheets = pd.read_excel(EXCEL, sheet_name=None)</w:t>
-      </w:r>
-    </w:p>
-    <w:p>
-      <w:r>
-        <w:t xml:space="preserve">    except Exception:</w:t>
-      </w:r>
-    </w:p>
-    <w:p>
-      <w:r>
-        <w:t xml:space="preserve">        try: os.remove(EXCEL)</w:t>
-      </w:r>
-    </w:p>
-    <w:p>
-      <w:r>
-        <w:t xml:space="preserve">        except: pass</w:t>
-      </w:r>
-    </w:p>
-    <w:p>
-      <w:r>
         <w:t xml:space="preserve">        return ensure_workbook()</w:t>
       </w:r>
     </w:p>
@@ -600,7 +600,6 @@
     <w:p/>
     <w:p>
       <w:r>
-        <w:lastRenderedPageBreak/>
         <w:t xml:space="preserve">    all_sheets[SHEET_SPECS] = build_specs_df()</w:t>
       </w:r>
     </w:p>
@@ -720,46 +719,356 @@
     <w:p/>
     <w:p>
       <w:r>
+        <w:t xml:space="preserve">    if df.empty:</w:t>
+      </w:r>
+    </w:p>
+    <w:p>
+      <w:r>
+        <w:t xml:space="preserve">        return False, "No specs available for export"</w:t>
+      </w:r>
+    </w:p>
+    <w:p/>
+    <w:p>
+      <w:r>
+        <w:t xml:space="preserve">    for c in ["Nominal", "LSL", "USL", "Tolerance"]:</w:t>
+      </w:r>
+    </w:p>
+    <w:p>
+      <w:r>
+        <w:t xml:space="preserve">        df[c] = pd.to_numeric(df[c], errors="coerce")</w:t>
+      </w:r>
+    </w:p>
+    <w:p/>
+    <w:p>
+      <w:r>
+        <w:t xml:space="preserve">    df.to_csv(filename, index=False)</w:t>
+      </w:r>
+    </w:p>
+    <w:p>
+      <w:r>
+        <w:t xml:space="preserve">    return True, os.path.abspath(filename)</w:t>
+      </w:r>
+    </w:p>
+    <w:p/>
+    <w:p>
+      <w:r>
+        <w:t># ---------- Excel formatting ----------</w:t>
+      </w:r>
+    </w:p>
+    <w:p>
+      <w:r>
+        <w:t>def apply_excel_coloring_and_separator(data_sheets):</w:t>
+      </w:r>
+    </w:p>
+    <w:p>
+      <w:r>
+        <w:t xml:space="preserve">    if not os.path.exists(EXCEL):</w:t>
+      </w:r>
+    </w:p>
+    <w:p>
+      <w:r>
+        <w:t xml:space="preserve">        return</w:t>
+      </w:r>
+    </w:p>
+    <w:p>
+      <w:r>
+        <w:t xml:space="preserve">    try:</w:t>
+      </w:r>
+    </w:p>
+    <w:p>
+      <w:r>
+        <w:t xml:space="preserve">        wb = load_workbook(EXCEL)</w:t>
+      </w:r>
+    </w:p>
+    <w:p>
+      <w:r>
+        <w:t xml:space="preserve">    except Exception:</w:t>
+      </w:r>
+    </w:p>
+    <w:p>
+      <w:r>
+        <w:t xml:space="preserve">        return</w:t>
+      </w:r>
+    </w:p>
+    <w:p/>
+    <w:p>
+      <w:r>
+        <w:t xml:space="preserve">    red_fill = PatternFill(start_color="FFC7CE", end_color="FFC7CE", fill_type="solid")</w:t>
+      </w:r>
+    </w:p>
+    <w:p>
+      <w:r>
+        <w:t xml:space="preserve">    thick_side = Side(border_style="medium", color="000000")</w:t>
+      </w:r>
+    </w:p>
+    <w:p>
+      <w:r>
+        <w:t xml:space="preserve">    def set_bottom_border(ws, row_idx, ncols):</w:t>
+      </w:r>
+    </w:p>
+    <w:p>
+      <w:r>
+        <w:t xml:space="preserve">        for c in range(1, ncols + 1):</w:t>
+      </w:r>
+    </w:p>
+    <w:p>
+      <w:r>
+        <w:t xml:space="preserve">            cell = ws.cell(row=row_idx, column=c)</w:t>
+      </w:r>
+    </w:p>
+    <w:p>
+      <w:r>
+        <w:t xml:space="preserve">            top = cell.border.top; left = cell.border.left; right = cell.border.right</w:t>
+      </w:r>
+    </w:p>
+    <w:p>
+      <w:r>
+        <w:t xml:space="preserve">            cell.border = Border(top=top, left=left, right=right, bottom=thick_side)</w:t>
+      </w:r>
+    </w:p>
+    <w:p/>
+    <w:p>
+      <w:r>
+        <w:t xml:space="preserve">    for sheet_name in data_sheets:</w:t>
+      </w:r>
+    </w:p>
+    <w:p>
+      <w:r>
+        <w:t xml:space="preserve">        if sheet_name not in wb.sheetnames: continue</w:t>
+      </w:r>
+    </w:p>
+    <w:p>
+      <w:r>
+        <w:t xml:space="preserve">        ws = wb[sheet_name]</w:t>
+      </w:r>
+    </w:p>
+    <w:p>
+      <w:r>
+        <w:t xml:space="preserve">        try:</w:t>
+      </w:r>
+    </w:p>
+    <w:p>
+      <w:r>
+        <w:t xml:space="preserve">            header = [cell.value for cell in next(ws.iter_rows(min_row=1, max_row=1))]</w:t>
+      </w:r>
+    </w:p>
+    <w:p>
+      <w:r>
+        <w:t xml:space="preserve">        except StopIteration:</w:t>
+      </w:r>
+    </w:p>
+    <w:p>
+      <w:r>
+        <w:t xml:space="preserve">            continue</w:t>
+      </w:r>
+    </w:p>
+    <w:p>
+      <w:r>
+        <w:t xml:space="preserve">        ncols = max(1, len(header))</w:t>
+      </w:r>
+    </w:p>
+    <w:p>
+      <w:r>
+        <w:t xml:space="preserve">        try:</w:t>
+      </w:r>
+    </w:p>
+    <w:p>
+      <w:r>
+        <w:t xml:space="preserve">            status_col_idx = header.index("Status") + 1</w:t>
+      </w:r>
+    </w:p>
+    <w:p>
+      <w:r>
+        <w:t xml:space="preserve">        except ValueError:</w:t>
+      </w:r>
+    </w:p>
+    <w:p>
+      <w:r>
+        <w:t xml:space="preserve">            status_col_idx = None</w:t>
+      </w:r>
+    </w:p>
+    <w:p>
+      <w:r>
+        <w:t xml:space="preserve">        timestamp_idx = header.index("Timestamp") + 1 if "Timestamp" in header else None</w:t>
+      </w:r>
+    </w:p>
+    <w:p>
+      <w:r>
+        <w:t xml:space="preserve">        pieceid_idx = header.index("Piece ID") + 1 if "Piece ID" in header else None</w:t>
+      </w:r>
+    </w:p>
+    <w:p/>
+    <w:p>
+      <w:r>
+        <w:t xml:space="preserve">        prev_group = None</w:t>
+      </w:r>
+    </w:p>
+    <w:p>
+      <w:r>
+        <w:t xml:space="preserve">        for r in range(2, ws.max_row + 1):</w:t>
+      </w:r>
+    </w:p>
+    <w:p>
+      <w:r>
+        <w:t xml:space="preserve">            if status_col_idx:</w:t>
+      </w:r>
+    </w:p>
+    <w:p>
+      <w:r>
+        <w:t xml:space="preserve">                status_cell = ws.cell(row=r, column=status_col_idx)</w:t>
+      </w:r>
+    </w:p>
+    <w:p>
+      <w:r>
+        <w:t xml:space="preserve">                if status_cell.value and str(status_cell.value).strip().upper() == "FAIL":</w:t>
+      </w:r>
+    </w:p>
+    <w:p>
+      <w:r>
+        <w:t xml:space="preserve">                    for c in range(1, ncols + 1):</w:t>
+      </w:r>
+    </w:p>
+    <w:p>
+      <w:r>
+        <w:t xml:space="preserve">                        ws.cell(row=r, column=c).fill = red_fill</w:t>
+      </w:r>
+    </w:p>
+    <w:p>
+      <w:r>
+        <w:t xml:space="preserve">            if timestamp_idx and pieceid_idx:</w:t>
+      </w:r>
+    </w:p>
+    <w:p>
+      <w:r>
+        <w:t xml:space="preserve">                ts_val = ws.cell(row=r, column=timestamp_idx).value</w:t>
+      </w:r>
+    </w:p>
+    <w:p>
+      <w:r>
+        <w:t xml:space="preserve">                pid_val = ws.cell(row=r, column=pieceid_idx).value</w:t>
+      </w:r>
+    </w:p>
+    <w:p>
+      <w:r>
         <w:lastRenderedPageBreak/>
-        <w:t xml:space="preserve">    if df.empty:</w:t>
-      </w:r>
-    </w:p>
-    <w:p>
-      <w:r>
-        <w:t xml:space="preserve">        return False, "No specs available for export"</w:t>
-      </w:r>
-    </w:p>
-    <w:p/>
-    <w:p>
-      <w:r>
-        <w:t xml:space="preserve">    for c in ["Nominal", "LSL", "USL", "Tolerance"]:</w:t>
-      </w:r>
-    </w:p>
-    <w:p>
-      <w:r>
-        <w:t xml:space="preserve">        df[c] = pd.to_numeric(df[c], errors="coerce")</w:t>
-      </w:r>
-    </w:p>
-    <w:p/>
-    <w:p>
-      <w:r>
-        <w:t xml:space="preserve">    df.to_csv(filename, index=False)</w:t>
-      </w:r>
-    </w:p>
-    <w:p>
-      <w:r>
-        <w:t xml:space="preserve">    return True, os.path.abspath(filename)</w:t>
-      </w:r>
-    </w:p>
-    <w:p/>
-    <w:p>
-      <w:r>
-        <w:t># ---------- Excel formatting ----------</w:t>
-      </w:r>
-    </w:p>
-    <w:p>
-      <w:r>
-        <w:t>def apply_excel_coloring_and_separator(data_sheets):</w:t>
+        <w:t xml:space="preserve">                group_key = (ts_val, pid_val)</w:t>
+      </w:r>
+    </w:p>
+    <w:p>
+      <w:r>
+        <w:t xml:space="preserve">            else:</w:t>
+      </w:r>
+    </w:p>
+    <w:p>
+      <w:r>
+        <w:t xml:space="preserve">                pid_val = ws.cell(row=r, column=pieceid_idx).value if pieceid_idx else None</w:t>
+      </w:r>
+    </w:p>
+    <w:p>
+      <w:r>
+        <w:t xml:space="preserve">                group_key = (None, pid_val)</w:t>
+      </w:r>
+    </w:p>
+    <w:p>
+      <w:r>
+        <w:t xml:space="preserve">            if prev_group is not None and group_key != prev_group:</w:t>
+      </w:r>
+    </w:p>
+    <w:p>
+      <w:r>
+        <w:t xml:space="preserve">                set_bottom_border(ws, r - 1, ncols)</w:t>
+      </w:r>
+    </w:p>
+    <w:p>
+      <w:r>
+        <w:t xml:space="preserve">            prev_group = group_key</w:t>
+      </w:r>
+    </w:p>
+    <w:p>
+      <w:r>
+        <w:t xml:space="preserve">        if ws.max_row &gt;= 2:</w:t>
+      </w:r>
+    </w:p>
+    <w:p>
+      <w:r>
+        <w:t xml:space="preserve">            set_bottom_border(ws, ws.max_row, ncols)</w:t>
+      </w:r>
+    </w:p>
+    <w:p/>
+    <w:p>
+      <w:r>
+        <w:t xml:space="preserve">    try: wb.save(EXCEL)</w:t>
+      </w:r>
+    </w:p>
+    <w:p>
+      <w:r>
+        <w:t xml:space="preserve">    except: pass</w:t>
+      </w:r>
+    </w:p>
+    <w:p>
+      <w:r>
+        <w:t xml:space="preserve">    wb.close()</w:t>
+      </w:r>
+    </w:p>
+    <w:p/>
+    <w:p>
+      <w:r>
+        <w:t>from openpyxl.utils import get_column_letter</w:t>
+      </w:r>
+    </w:p>
+    <w:p/>
+    <w:p>
+      <w:r>
+        <w:t>from openpyxl.utils import get_column_letter</w:t>
+      </w:r>
+    </w:p>
+    <w:p>
+      <w:r>
+        <w:t>from openpyxl.drawing.image import Image as XLImage</w:t>
+      </w:r>
+    </w:p>
+    <w:p>
+      <w:r>
+        <w:t>import os</w:t>
+      </w:r>
+    </w:p>
+    <w:p/>
+    <w:p>
+      <w:r>
+        <w:t>from openpyxl.utils import get_column_letter</w:t>
+      </w:r>
+    </w:p>
+    <w:p>
+      <w:r>
+        <w:t>from openpyxl.drawing.image import Image as XLImage</w:t>
+      </w:r>
+    </w:p>
+    <w:p>
+      <w:r>
+        <w:t>import os</w:t>
+      </w:r>
+    </w:p>
+    <w:p/>
+    <w:p>
+      <w:r>
+        <w:t>from openpyxl.utils import get_column_letter</w:t>
+      </w:r>
+    </w:p>
+    <w:p>
+      <w:r>
+        <w:t>from openpyxl.drawing.image import Image as XLImage</w:t>
+      </w:r>
+    </w:p>
+    <w:p>
+      <w:r>
+        <w:lastRenderedPageBreak/>
+        <w:t>import os</w:t>
+      </w:r>
+    </w:p>
+    <w:p/>
+    <w:p>
+      <w:r>
+        <w:t>def add_reference_image():</w:t>
       </w:r>
     </w:p>
     <w:p>
@@ -784,65 +1093,318 @@
     </w:p>
     <w:p>
       <w:r>
+        <w:t xml:space="preserve">    except:</w:t>
+      </w:r>
+    </w:p>
+    <w:p>
+      <w:r>
+        <w:t xml:space="preserve">        return</w:t>
+      </w:r>
+    </w:p>
+    <w:p/>
+    <w:p>
+      <w:r>
+        <w:t xml:space="preserve">    # --- GW Reference ---</w:t>
+      </w:r>
+    </w:p>
+    <w:p>
+      <w:r>
+        <w:t xml:space="preserve">    gw_sheet_name = "GW Reference Photo"</w:t>
+      </w:r>
+    </w:p>
+    <w:p>
+      <w:r>
+        <w:t xml:space="preserve">    ws_gw = wb[gw_sheet_name] if gw_sheet_name in wb.sheetnames else wb.create_sheet(gw_sheet_name)</w:t>
+      </w:r>
+    </w:p>
+    <w:p>
+      <w:r>
+        <w:t xml:space="preserve">    ws_gw.sheet_view.showGridLines = False</w:t>
+      </w:r>
+    </w:p>
+    <w:p/>
+    <w:p>
+      <w:r>
+        <w:t xml:space="preserve">    gw_imgs = ["TestGWB.png", "TestGWBtri.png"]</w:t>
+      </w:r>
+    </w:p>
+    <w:p>
+      <w:r>
+        <w:t xml:space="preserve">    row_start = 1</w:t>
+      </w:r>
+    </w:p>
+    <w:p>
+      <w:r>
+        <w:t xml:space="preserve">    for img_path in gw_imgs:</w:t>
+      </w:r>
+    </w:p>
+    <w:p>
+      <w:r>
+        <w:t xml:space="preserve">        if os.path.exists(img_path):</w:t>
+      </w:r>
+    </w:p>
+    <w:p>
+      <w:r>
+        <w:t xml:space="preserve">            img = XLImage(img_path)</w:t>
+      </w:r>
+    </w:p>
+    <w:p>
+      <w:r>
+        <w:t xml:space="preserve">            ws_gw.add_image(img, f"A{row_start}")</w:t>
+      </w:r>
+    </w:p>
+    <w:p>
+      <w:r>
+        <w:t xml:space="preserve">            # auto-fit row height (approx scaling for Excel)</w:t>
+      </w:r>
+    </w:p>
+    <w:p>
+      <w:r>
+        <w:t xml:space="preserve">            ws_gw.row_dimensions[row_start].height = img.height * 0.75</w:t>
+      </w:r>
+    </w:p>
+    <w:p>
+      <w:r>
+        <w:t xml:space="preserve">            # next image row: use current row + image row span</w:t>
+      </w:r>
+    </w:p>
+    <w:p>
+      <w:r>
+        <w:t xml:space="preserve">            row_start += max(int(img.height / 15), 1)  # minimal gap</w:t>
+      </w:r>
+    </w:p>
+    <w:p/>
+    <w:p>
+      <w:r>
+        <w:t xml:space="preserve">    # --- MI Reference ---</w:t>
+      </w:r>
+    </w:p>
+    <w:p>
+      <w:r>
+        <w:t xml:space="preserve">    mi_sheet_name = "MI Reference Photo"</w:t>
+      </w:r>
+    </w:p>
+    <w:p>
+      <w:r>
+        <w:t xml:space="preserve">    ws_mi = wb[mi_sheet_name] if mi_sheet_name in wb.sheetnames else wb.create_sheet(mi_sheet_name)</w:t>
+      </w:r>
+    </w:p>
+    <w:p>
+      <w:r>
+        <w:t xml:space="preserve">    ws_mi.sheet_view.showGridLines = False</w:t>
+      </w:r>
+    </w:p>
+    <w:p/>
+    <w:p>
+      <w:r>
+        <w:t xml:space="preserve">    mi_images = ["MBtop.png", "MBbot.png", "MBtri.png"]</w:t>
+      </w:r>
+    </w:p>
+    <w:p>
+      <w:r>
+        <w:t xml:space="preserve">    col_start = 1</w:t>
+      </w:r>
+    </w:p>
+    <w:p>
+      <w:r>
+        <w:t xml:space="preserve">    for img_file in mi_images:</w:t>
+      </w:r>
+    </w:p>
+    <w:p>
+      <w:r>
+        <w:t xml:space="preserve">        if os.path.exists(img_file):</w:t>
+      </w:r>
+    </w:p>
+    <w:p>
+      <w:r>
+        <w:t xml:space="preserve">            img = XLImage(img_file)</w:t>
+      </w:r>
+    </w:p>
+    <w:p>
+      <w:r>
+        <w:t xml:space="preserve">            col_letter = get_column_letter(col_start)</w:t>
+      </w:r>
+    </w:p>
+    <w:p>
+      <w:r>
+        <w:t xml:space="preserve">            ws_mi.add_image(img, f"{col_letter}1")</w:t>
+      </w:r>
+    </w:p>
+    <w:p>
+      <w:r>
+        <w:t xml:space="preserve">            # auto-fit column width</w:t>
+      </w:r>
+    </w:p>
+    <w:p>
+      <w:r>
+        <w:t xml:space="preserve">            ws_mi.column_dimensions[col_letter].width = img.width / 7  # Excel column width scale</w:t>
+      </w:r>
+    </w:p>
+    <w:p>
+      <w:r>
+        <w:t xml:space="preserve">            # auto-fit row height (first row)</w:t>
+      </w:r>
+    </w:p>
+    <w:p>
+      <w:r>
+        <w:t xml:space="preserve">            ws_mi.row_dimensions[1].height = max(ws_mi.row_dimensions[1].height or 15, img.height * 0.75)</w:t>
+      </w:r>
+    </w:p>
+    <w:p>
+      <w:r>
+        <w:t xml:space="preserve">            col_start += max(int(img.width / 60), 3)  # horizontal gap</w:t>
+      </w:r>
+    </w:p>
+    <w:p/>
+    <w:p>
+      <w:r>
+        <w:t xml:space="preserve">    try:</w:t>
+      </w:r>
+    </w:p>
+    <w:p>
+      <w:r>
+        <w:t xml:space="preserve">        wb.save(EXCEL)</w:t>
+      </w:r>
+    </w:p>
+    <w:p>
+      <w:r>
+        <w:t xml:space="preserve">    except:</w:t>
+      </w:r>
+    </w:p>
+    <w:p>
+      <w:r>
+        <w:t xml:space="preserve">        pass</w:t>
+      </w:r>
+    </w:p>
+    <w:p>
+      <w:r>
+        <w:t xml:space="preserve">    wb.close()</w:t>
+      </w:r>
+    </w:p>
+    <w:p/>
+    <w:p/>
+    <w:p>
+      <w:r>
+        <w:t># ---------- Core API for Streamlit ----------</w:t>
+      </w:r>
+    </w:p>
+    <w:p>
+      <w:r>
+        <w:t>def _status_from_value(part, hole, feat, val):</w:t>
+      </w:r>
+    </w:p>
+    <w:p>
+      <w:r>
+        <w:t xml:space="preserve">    try:</w:t>
+      </w:r>
+    </w:p>
+    <w:p>
+      <w:r>
+        <w:t xml:space="preserve">        nominal, lsl, usl = SPECS[part][hole][feat]</w:t>
+      </w:r>
+    </w:p>
+    <w:p>
+      <w:r>
+        <w:t xml:space="preserve">        return "PASS" if (lsl &lt;= val &lt;= usl) else "FAIL", nominal, lsl, usl</w:t>
+      </w:r>
+    </w:p>
+    <w:p>
+      <w:r>
         <w:t xml:space="preserve">    except Exception:</w:t>
       </w:r>
     </w:p>
     <w:p>
       <w:r>
-        <w:t xml:space="preserve">        return</w:t>
-      </w:r>
-    </w:p>
-    <w:p/>
-    <w:p>
-      <w:r>
-        <w:t xml:space="preserve">    red_fill = PatternFill(start_color="FFC7CE", end_color="FFC7CE", fill_type="solid")</w:t>
-      </w:r>
-    </w:p>
-    <w:p>
-      <w:r>
-        <w:t xml:space="preserve">    thick_side = Side(border_style="medium", color="000000")</w:t>
-      </w:r>
-    </w:p>
-    <w:p>
-      <w:r>
-        <w:t xml:space="preserve">    def set_bottom_border(ws, row_idx, ncols):</w:t>
-      </w:r>
-    </w:p>
-    <w:p>
-      <w:r>
-        <w:t xml:space="preserve">        for c in range(1, ncols + 1):</w:t>
-      </w:r>
-    </w:p>
-    <w:p>
-      <w:r>
-        <w:t xml:space="preserve">            cell = ws.cell(row=row_idx, column=c)</w:t>
-      </w:r>
-    </w:p>
-    <w:p>
-      <w:r>
-        <w:t xml:space="preserve">            top = cell.border.top; left = cell.border.left; right = cell.border.right</w:t>
-      </w:r>
-    </w:p>
-    <w:p>
-      <w:r>
-        <w:t xml:space="preserve">            cell.border = Border(top=top, left=left, right=right, bottom=thick_side)</w:t>
+        <w:t xml:space="preserve">        return ("PASS" if val is not None else "FAIL", None, None, None)</w:t>
+      </w:r>
+    </w:p>
+    <w:p/>
+    <w:p>
+      <w:r>
+        <w:t>def add_measurement_rows(part, machine, chamber, piece_id, part_flow, notes, measurements, measured_date=None, batch_number=None, timestamp=None):</w:t>
+      </w:r>
+    </w:p>
+    <w:p>
+      <w:r>
+        <w:t xml:space="preserve">    ensure_workbook()</w:t>
+      </w:r>
+    </w:p>
+    <w:p>
+      <w:r>
+        <w:t xml:space="preserve">    ts = timestamp if timestamp is not None else datetime.now().strftime("%Y-%m-%d %H:%M:%S")</w:t>
+      </w:r>
+    </w:p>
+    <w:p>
+      <w:r>
+        <w:t xml:space="preserve">    df_part = read_sheet_safe(SHEET_MB if part == "Mixing Block" else SHEET_GW)</w:t>
+      </w:r>
+    </w:p>
+    <w:p>
+      <w:r>
+        <w:t xml:space="preserve">    df_other = read_sheet_safe(SHEET_GW if part == "Mixing Block" else SHEET_MB)</w:t>
+      </w:r>
+    </w:p>
+    <w:p>
+      <w:r>
+        <w:t xml:space="preserve">    df_specs = read_sheet_safe(SHEET_SPECS)</w:t>
+      </w:r>
+    </w:p>
+    <w:p/>
+    <w:p>
+      <w:r>
+        <w:t xml:space="preserve">    # Format measured date to only YYYY-MM-DD</w:t>
+      </w:r>
+    </w:p>
+    <w:p>
+      <w:r>
+        <w:t xml:space="preserve">    if measured_date is None:</w:t>
+      </w:r>
+    </w:p>
+    <w:p>
+      <w:r>
+        <w:t xml:space="preserve">        measured_date_str = datetime.now().strftime("%Y-%m-%d")</w:t>
+      </w:r>
+    </w:p>
+    <w:p>
+      <w:r>
+        <w:t xml:space="preserve">    else:</w:t>
+      </w:r>
+    </w:p>
+    <w:p>
+      <w:r>
+        <w:t xml:space="preserve">        measured_date_str = str(measured_date)</w:t>
+      </w:r>
+    </w:p>
+    <w:p>
+      <w:r>
+        <w:t xml:space="preserve">        if isinstance(measured_date, datetime):</w:t>
+      </w:r>
+    </w:p>
+    <w:p>
+      <w:r>
+        <w:t xml:space="preserve">            measured_date_str = measured_date.strftime("%Y-%m-%d")</w:t>
       </w:r>
     </w:p>
     <w:p/>
     <w:p>
       <w:r>
         <w:lastRenderedPageBreak/>
-        <w:t xml:space="preserve">    for sheet_name in data_sheets:</w:t>
-      </w:r>
-    </w:p>
-    <w:p>
-      <w:r>
-        <w:t xml:space="preserve">        if sheet_name not in wb.sheetnames: continue</w:t>
-      </w:r>
-    </w:p>
-    <w:p>
-      <w:r>
-        <w:t xml:space="preserve">        ws = wb[sheet_name]</w:t>
+        <w:t xml:space="preserve">    rows = []</w:t>
+      </w:r>
+    </w:p>
+    <w:p>
+      <w:r>
+        <w:t xml:space="preserve">    for m in measurements:</w:t>
+      </w:r>
+    </w:p>
+    <w:p>
+      <w:r>
+        <w:t xml:space="preserve">        hole = str(m.get("Hole")).lstrip("H")</w:t>
+      </w:r>
+    </w:p>
+    <w:p>
+      <w:r>
+        <w:t xml:space="preserve">        feat = m.get("Feature")</w:t>
       </w:r>
     </w:p>
     <w:p>
@@ -852,534 +1414,6 @@
     </w:p>
     <w:p>
       <w:r>
-        <w:t xml:space="preserve">            header = [cell.value for cell in next(ws.iter_rows(min_row=1, max_row=1))]</w:t>
-      </w:r>
-    </w:p>
-    <w:p>
-      <w:r>
-        <w:t xml:space="preserve">        except StopIteration:</w:t>
-      </w:r>
-    </w:p>
-    <w:p>
-      <w:r>
-        <w:t xml:space="preserve">            continue</w:t>
-      </w:r>
-    </w:p>
-    <w:p>
-      <w:r>
-        <w:t xml:space="preserve">        ncols = max(1, len(header))</w:t>
-      </w:r>
-    </w:p>
-    <w:p>
-      <w:r>
-        <w:t xml:space="preserve">        try:</w:t>
-      </w:r>
-    </w:p>
-    <w:p>
-      <w:r>
-        <w:t xml:space="preserve">            status_col_idx = header.index("Status") + 1</w:t>
-      </w:r>
-    </w:p>
-    <w:p>
-      <w:r>
-        <w:t xml:space="preserve">        except ValueError:</w:t>
-      </w:r>
-    </w:p>
-    <w:p>
-      <w:r>
-        <w:t xml:space="preserve">            status_col_idx = None</w:t>
-      </w:r>
-    </w:p>
-    <w:p>
-      <w:r>
-        <w:t xml:space="preserve">        timestamp_idx = header.index("Timestamp") + 1 if "Timestamp" in header else None</w:t>
-      </w:r>
-    </w:p>
-    <w:p>
-      <w:r>
-        <w:t xml:space="preserve">        pieceid_idx = header.index("Piece ID") + 1 if "Piece ID" in header else None</w:t>
-      </w:r>
-    </w:p>
-    <w:p/>
-    <w:p>
-      <w:r>
-        <w:t xml:space="preserve">        prev_group = None</w:t>
-      </w:r>
-    </w:p>
-    <w:p>
-      <w:r>
-        <w:t xml:space="preserve">        for r in range(2, ws.max_row + 1):</w:t>
-      </w:r>
-    </w:p>
-    <w:p>
-      <w:r>
-        <w:t xml:space="preserve">            if status_col_idx:</w:t>
-      </w:r>
-    </w:p>
-    <w:p>
-      <w:r>
-        <w:t xml:space="preserve">                status_cell = ws.cell(row=r, column=status_col_idx)</w:t>
-      </w:r>
-    </w:p>
-    <w:p>
-      <w:r>
-        <w:t xml:space="preserve">                if status_cell.value and str(status_cell.value).strip().upper() == "FAIL":</w:t>
-      </w:r>
-    </w:p>
-    <w:p>
-      <w:r>
-        <w:t xml:space="preserve">                    for c in range(1, ncols + 1):</w:t>
-      </w:r>
-    </w:p>
-    <w:p>
-      <w:r>
-        <w:t xml:space="preserve">                        ws.cell(row=r, column=c).fill = red_fill</w:t>
-      </w:r>
-    </w:p>
-    <w:p>
-      <w:r>
-        <w:t xml:space="preserve">            if timestamp_idx and pieceid_idx:</w:t>
-      </w:r>
-    </w:p>
-    <w:p>
-      <w:r>
-        <w:t xml:space="preserve">                ts_val = ws.cell(row=r, column=timestamp_idx).value</w:t>
-      </w:r>
-    </w:p>
-    <w:p>
-      <w:r>
-        <w:t xml:space="preserve">                pid_val = ws.cell(row=r, column=pieceid_idx).value</w:t>
-      </w:r>
-    </w:p>
-    <w:p>
-      <w:r>
-        <w:t xml:space="preserve">                group_key = (ts_val, pid_val)</w:t>
-      </w:r>
-    </w:p>
-    <w:p>
-      <w:r>
-        <w:lastRenderedPageBreak/>
-        <w:t xml:space="preserve">            else:</w:t>
-      </w:r>
-    </w:p>
-    <w:p>
-      <w:r>
-        <w:t xml:space="preserve">                pid_val = ws.cell(row=r, column=pieceid_idx).value if pieceid_idx else None</w:t>
-      </w:r>
-    </w:p>
-    <w:p>
-      <w:r>
-        <w:t xml:space="preserve">                group_key = (None, pid_val)</w:t>
-      </w:r>
-    </w:p>
-    <w:p>
-      <w:r>
-        <w:t xml:space="preserve">            if prev_group is not None and group_key != prev_group:</w:t>
-      </w:r>
-    </w:p>
-    <w:p>
-      <w:r>
-        <w:t xml:space="preserve">                set_bottom_border(ws, r - 1, ncols)</w:t>
-      </w:r>
-    </w:p>
-    <w:p>
-      <w:r>
-        <w:t xml:space="preserve">            prev_group = group_key</w:t>
-      </w:r>
-    </w:p>
-    <w:p>
-      <w:r>
-        <w:t xml:space="preserve">        if ws.max_row &gt;= 2:</w:t>
-      </w:r>
-    </w:p>
-    <w:p>
-      <w:r>
-        <w:t xml:space="preserve">            set_bottom_border(ws, ws.max_row, ncols)</w:t>
-      </w:r>
-    </w:p>
-    <w:p/>
-    <w:p>
-      <w:r>
-        <w:t xml:space="preserve">    try: wb.save(EXCEL)</w:t>
-      </w:r>
-    </w:p>
-    <w:p>
-      <w:r>
-        <w:t xml:space="preserve">    except: pass</w:t>
-      </w:r>
-    </w:p>
-    <w:p>
-      <w:r>
-        <w:t xml:space="preserve">    wb.close()</w:t>
-      </w:r>
-    </w:p>
-    <w:p/>
-    <w:p>
-      <w:r>
-        <w:t>from openpyxl.utils import get_column_letter</w:t>
-      </w:r>
-    </w:p>
-    <w:p/>
-    <w:p>
-      <w:r>
-        <w:t>from openpyxl.utils import get_column_letter</w:t>
-      </w:r>
-    </w:p>
-    <w:p>
-      <w:r>
-        <w:t>from openpyxl.drawing.image import Image as XLImage</w:t>
-      </w:r>
-    </w:p>
-    <w:p>
-      <w:r>
-        <w:t>import os</w:t>
-      </w:r>
-    </w:p>
-    <w:p/>
-    <w:p>
-      <w:r>
-        <w:t>from openpyxl.utils import get_column_letter</w:t>
-      </w:r>
-    </w:p>
-    <w:p>
-      <w:r>
-        <w:t>from openpyxl.drawing.image import Image as XLImage</w:t>
-      </w:r>
-    </w:p>
-    <w:p>
-      <w:r>
-        <w:t>import os</w:t>
-      </w:r>
-    </w:p>
-    <w:p/>
-    <w:p>
-      <w:r>
-        <w:t>from openpyxl.utils import get_column_letter</w:t>
-      </w:r>
-    </w:p>
-    <w:p>
-      <w:r>
-        <w:t>from openpyxl.drawing.image import Image as XLImage</w:t>
-      </w:r>
-    </w:p>
-    <w:p>
-      <w:r>
-        <w:t>import os</w:t>
-      </w:r>
-    </w:p>
-    <w:p/>
-    <w:p>
-      <w:r>
-        <w:t>def add_reference_image():</w:t>
-      </w:r>
-    </w:p>
-    <w:p>
-      <w:r>
-        <w:t xml:space="preserve">    if not os.path.exists(EXCEL):</w:t>
-      </w:r>
-    </w:p>
-    <w:p>
-      <w:r>
-        <w:t xml:space="preserve">        return</w:t>
-      </w:r>
-    </w:p>
-    <w:p>
-      <w:r>
-        <w:t xml:space="preserve">    try:</w:t>
-      </w:r>
-    </w:p>
-    <w:p>
-      <w:r>
-        <w:t xml:space="preserve">        wb = load_workbook(EXCEL)</w:t>
-      </w:r>
-    </w:p>
-    <w:p>
-      <w:r>
-        <w:t xml:space="preserve">    except:</w:t>
-      </w:r>
-    </w:p>
-    <w:p>
-      <w:r>
-        <w:t xml:space="preserve">        return</w:t>
-      </w:r>
-    </w:p>
-    <w:p/>
-    <w:p>
-      <w:r>
-        <w:t xml:space="preserve">    # --- GW Reference ---</w:t>
-      </w:r>
-    </w:p>
-    <w:p>
-      <w:r>
-        <w:t xml:space="preserve">    gw_sheet_name = "GW Reference Photo"</w:t>
-      </w:r>
-    </w:p>
-    <w:p>
-      <w:r>
-        <w:t xml:space="preserve">    ws_gw = wb[gw_sheet_name] if gw_sheet_name in wb.sheetnames else wb.create_sheet(gw_sheet_name)</w:t>
-      </w:r>
-    </w:p>
-    <w:p>
-      <w:r>
-        <w:t xml:space="preserve">    ws_gw.sheet_view.showGridLines = False</w:t>
-      </w:r>
-    </w:p>
-    <w:p/>
-    <w:p>
-      <w:r>
-        <w:t xml:space="preserve">    gw_imgs = ["TestGWB.png", "TestGWBtri.png"]</w:t>
-      </w:r>
-    </w:p>
-    <w:p>
-      <w:r>
-        <w:t xml:space="preserve">    row_start = 1</w:t>
-      </w:r>
-    </w:p>
-    <w:p>
-      <w:r>
-        <w:t xml:space="preserve">    for img_path in gw_imgs:</w:t>
-      </w:r>
-    </w:p>
-    <w:p>
-      <w:r>
-        <w:t xml:space="preserve">        if os.path.exists(img_path):</w:t>
-      </w:r>
-    </w:p>
-    <w:p>
-      <w:r>
-        <w:t xml:space="preserve">            img = XLImage(img_path)</w:t>
-      </w:r>
-    </w:p>
-    <w:p>
-      <w:r>
-        <w:t xml:space="preserve">            ws_gw.add_image(img, f"A{row_start}")</w:t>
-      </w:r>
-    </w:p>
-    <w:p>
-      <w:r>
-        <w:t xml:space="preserve">            # auto-fit row height (approx scaling for Excel)</w:t>
-      </w:r>
-    </w:p>
-    <w:p>
-      <w:r>
-        <w:t xml:space="preserve">            ws_gw.row_dimensions[row_start].height = img.height * 0.75</w:t>
-      </w:r>
-    </w:p>
-    <w:p>
-      <w:r>
-        <w:t xml:space="preserve">            # next image row: use current row + image row span</w:t>
-      </w:r>
-    </w:p>
-    <w:p>
-      <w:r>
-        <w:t xml:space="preserve">            row_start += max(int(img.height / 15), 1)  # minimal gap</w:t>
-      </w:r>
-    </w:p>
-    <w:p/>
-    <w:p>
-      <w:r>
-        <w:lastRenderedPageBreak/>
-        <w:t xml:space="preserve">    # --- MI Reference ---</w:t>
-      </w:r>
-    </w:p>
-    <w:p>
-      <w:r>
-        <w:t xml:space="preserve">    mi_sheet_name = "MI Reference Photo"</w:t>
-      </w:r>
-    </w:p>
-    <w:p>
-      <w:r>
-        <w:t xml:space="preserve">    ws_mi = wb[mi_sheet_name] if mi_sheet_name in wb.sheetnames else wb.create_sheet(mi_sheet_name)</w:t>
-      </w:r>
-    </w:p>
-    <w:p>
-      <w:r>
-        <w:t xml:space="preserve">    ws_mi.sheet_view.showGridLines = False</w:t>
-      </w:r>
-    </w:p>
-    <w:p/>
-    <w:p>
-      <w:r>
-        <w:t xml:space="preserve">    mi_images = ["MBtop.png", "MBbot.png", "MBtri.png"]</w:t>
-      </w:r>
-    </w:p>
-    <w:p>
-      <w:r>
-        <w:t xml:space="preserve">    col_start = 1</w:t>
-      </w:r>
-    </w:p>
-    <w:p>
-      <w:r>
-        <w:t xml:space="preserve">    for img_file in mi_images:</w:t>
-      </w:r>
-    </w:p>
-    <w:p>
-      <w:r>
-        <w:t xml:space="preserve">        if os.path.exists(img_file):</w:t>
-      </w:r>
-    </w:p>
-    <w:p>
-      <w:r>
-        <w:t xml:space="preserve">            img = XLImage(img_file)</w:t>
-      </w:r>
-    </w:p>
-    <w:p>
-      <w:r>
-        <w:t xml:space="preserve">            col_letter = get_column_letter(col_start)</w:t>
-      </w:r>
-    </w:p>
-    <w:p>
-      <w:r>
-        <w:t xml:space="preserve">            ws_mi.add_image(img, f"{col_letter}1")</w:t>
-      </w:r>
-    </w:p>
-    <w:p>
-      <w:r>
-        <w:t xml:space="preserve">            # auto-fit column width</w:t>
-      </w:r>
-    </w:p>
-    <w:p>
-      <w:r>
-        <w:t xml:space="preserve">            ws_mi.column_dimensions[col_letter].width = img.width / 7  # Excel column width scale</w:t>
-      </w:r>
-    </w:p>
-    <w:p>
-      <w:r>
-        <w:t xml:space="preserve">            # auto-fit row height (first row)</w:t>
-      </w:r>
-    </w:p>
-    <w:p>
-      <w:r>
-        <w:t xml:space="preserve">            ws_mi.row_dimensions[1].height = max(ws_mi.row_dimensions[1].height or 15, img.height * 0.75)</w:t>
-      </w:r>
-    </w:p>
-    <w:p>
-      <w:r>
-        <w:t xml:space="preserve">            col_start += max(int(img.width / 60), 3)  # horizontal gap</w:t>
-      </w:r>
-    </w:p>
-    <w:p/>
-    <w:p>
-      <w:r>
-        <w:t xml:space="preserve">    try:</w:t>
-      </w:r>
-    </w:p>
-    <w:p>
-      <w:r>
-        <w:t xml:space="preserve">        wb.save(EXCEL)</w:t>
-      </w:r>
-    </w:p>
-    <w:p>
-      <w:r>
-        <w:t xml:space="preserve">    except:</w:t>
-      </w:r>
-    </w:p>
-    <w:p>
-      <w:r>
-        <w:t xml:space="preserve">        pass</w:t>
-      </w:r>
-    </w:p>
-    <w:p>
-      <w:r>
-        <w:t xml:space="preserve">    wb.close()</w:t>
-      </w:r>
-    </w:p>
-    <w:p/>
-    <w:p/>
-    <w:p>
-      <w:r>
-        <w:t># ---------- Core API for Streamlit ----------</w:t>
-      </w:r>
-    </w:p>
-    <w:p>
-      <w:r>
-        <w:t>def _status_from_value(part, hole, feat, val):</w:t>
-      </w:r>
-    </w:p>
-    <w:p>
-      <w:r>
-        <w:t xml:space="preserve">    try:</w:t>
-      </w:r>
-    </w:p>
-    <w:p>
-      <w:r>
-        <w:t xml:space="preserve">        nominal, lsl, usl = SPECS[part][hole][feat]</w:t>
-      </w:r>
-    </w:p>
-    <w:p>
-      <w:r>
-        <w:t xml:space="preserve">        return "PASS" if (lsl &lt;= val &lt;= usl) else "FAIL", nominal, lsl, usl</w:t>
-      </w:r>
-    </w:p>
-    <w:p>
-      <w:r>
-        <w:t xml:space="preserve">    except Exception:</w:t>
-      </w:r>
-    </w:p>
-    <w:p>
-      <w:r>
-        <w:t xml:space="preserve">        return ("PASS" if val is not None else "FAIL", None, None, None)</w:t>
-      </w:r>
-    </w:p>
-    <w:p/>
-    <w:p>
-      <w:r>
-        <w:t>def add_measurement_rows(part, machine, chamber, piece_id, part_flow, notes, measurements, timestamp=None):</w:t>
-      </w:r>
-    </w:p>
-    <w:p>
-      <w:r>
-        <w:t xml:space="preserve">    ensure_workbook()</w:t>
-      </w:r>
-    </w:p>
-    <w:p>
-      <w:r>
-        <w:t xml:space="preserve">    ts = timestamp if timestamp is not None else datetime.now().strftime("%Y-%m-%d %H:%M:%S")</w:t>
-      </w:r>
-    </w:p>
-    <w:p>
-      <w:r>
-        <w:t xml:space="preserve">    df_part = read_sheet_safe(SHEET_MB if part == "Mixing Block" else SHEET_GW)</w:t>
-      </w:r>
-    </w:p>
-    <w:p>
-      <w:r>
-        <w:t xml:space="preserve">    df_other = read_sheet_safe(SHEET_GW if part == "Mixing Block" else SHEET_MB)</w:t>
-      </w:r>
-    </w:p>
-    <w:p>
-      <w:r>
-        <w:t xml:space="preserve">    df_specs = read_sheet_safe(SHEET_SPECS)</w:t>
-      </w:r>
-    </w:p>
-    <w:p/>
-    <w:p>
-      <w:r>
-        <w:t xml:space="preserve">    rows = []</w:t>
-      </w:r>
-    </w:p>
-    <w:p>
-      <w:r>
-        <w:t xml:space="preserve">    for m in measurements:</w:t>
-      </w:r>
-    </w:p>
-    <w:p>
-      <w:r>
-        <w:t xml:space="preserve">        hole = str(m.get("Hole")).lstrip("H")</w:t>
-      </w:r>
-    </w:p>
-    <w:p>
-      <w:r>
-        <w:t xml:space="preserve">        feat = m.get("Feature")</w:t>
-      </w:r>
-    </w:p>
-    <w:p>
-      <w:r>
-        <w:t xml:space="preserve">        try:</w:t>
-      </w:r>
-    </w:p>
-    <w:p>
-      <w:r>
         <w:t xml:space="preserve">            val = float(m.get("Value"))</w:t>
       </w:r>
     </w:p>
@@ -1395,7 +1429,6 @@
     </w:p>
     <w:p>
       <w:r>
-        <w:lastRenderedPageBreak/>
         <w:t xml:space="preserve">        status, nominal, lsl, usl = _status_from_value(part, hole, feat, val if val is not None else 0.0)</w:t>
       </w:r>
     </w:p>
@@ -1416,7 +1449,7 @@
     </w:p>
     <w:p>
       <w:r>
-        <w:t xml:space="preserve">        img_path = m.get("ImagePath", None)  # should be full path string or None</w:t>
+        <w:t xml:space="preserve">        img_path = m.get("ImagePath", None)</w:t>
       </w:r>
     </w:p>
     <w:p/>
@@ -1432,6 +1465,11 @@
     </w:p>
     <w:p>
       <w:r>
+        <w:t xml:space="preserve">            "Measured Date": measured_date_str,</w:t>
+      </w:r>
+    </w:p>
+    <w:p>
+      <w:r>
         <w:t xml:space="preserve">            "Machine": machine,</w:t>
       </w:r>
     </w:p>
@@ -1442,6 +1480,16 @@
     </w:p>
     <w:p>
       <w:r>
+        <w:t xml:space="preserve">            "Part In/Out": part_flow,</w:t>
+      </w:r>
+    </w:p>
+    <w:p>
+      <w:r>
+        <w:t xml:space="preserve">            "Batch Cleaning": batch_number if batch_number is not None else "",  # &lt;-- only this column</w:t>
+      </w:r>
+    </w:p>
+    <w:p>
+      <w:r>
         <w:t xml:space="preserve">            "Chamber": chamber,</w:t>
       </w:r>
     </w:p>
@@ -1452,11 +1500,6 @@
     </w:p>
     <w:p>
       <w:r>
-        <w:t xml:space="preserve">            "Part In/Out": part_flow,</w:t>
-      </w:r>
-    </w:p>
-    <w:p>
-      <w:r>
         <w:t xml:space="preserve">            "Hole": f"H{hole}",</w:t>
       </w:r>
     </w:p>
@@ -1467,6 +1510,7 @@
     </w:p>
     <w:p>
       <w:r>
+        <w:lastRenderedPageBreak/>
         <w:t xml:space="preserve">            "Value": val,</w:t>
       </w:r>
     </w:p>
@@ -1497,7 +1541,7 @@
     </w:p>
     <w:p>
       <w:r>
-        <w:t xml:space="preserve">            "Image Path": img_path  # store the image path in the row</w:t>
+        <w:t xml:space="preserve">            "Image Path": img_path</w:t>
       </w:r>
     </w:p>
     <w:p>
@@ -1506,6 +1550,7 @@
       </w:r>
     </w:p>
     <w:p/>
+    <w:p/>
     <w:p>
       <w:r>
         <w:t xml:space="preserve">    if not rows:</w:t>
@@ -1519,7 +1564,7 @@
     <w:p/>
     <w:p>
       <w:r>
-        <w:t xml:space="preserve">    df_append = pd.DataFrame(rows, columns=DATA_COLS + ["Image Path"])  # add Image Path column</w:t>
+        <w:t xml:space="preserve">    df_append = pd.DataFrame(rows)</w:t>
       </w:r>
     </w:p>
     <w:p>
@@ -1572,6 +1617,7 @@
     <w:p/>
     <w:p>
       <w:r>
+        <w:lastRenderedPageBreak/>
         <w:t xml:space="preserve">    saved, alt = atomic_write_all(EXCEL, sheets)</w:t>
       </w:r>
     </w:p>
@@ -1587,7 +1633,7 @@
     </w:p>
     <w:p>
       <w:r>
-        <w:t xml:space="preserve">            add_reference_image()  # existing helper, keep</w:t>
+        <w:t xml:space="preserve">            add_reference_image()</w:t>
       </w:r>
     </w:p>
     <w:p>
@@ -1627,188 +1673,188 @@
     </w:p>
     <w:p>
       <w:r>
+        <w:t xml:space="preserve">    elif alt:</w:t>
+      </w:r>
+    </w:p>
+    <w:p>
+      <w:r>
+        <w:t xml:space="preserve">        return False, f"Excel locked — saved clone to: {alt}"</w:t>
+      </w:r>
+    </w:p>
+    <w:p>
+      <w:r>
+        <w:t xml:space="preserve">    else:</w:t>
+      </w:r>
+    </w:p>
+    <w:p>
+      <w:r>
+        <w:t xml:space="preserve">        return False, "Failed to save measurements"</w:t>
+      </w:r>
+    </w:p>
+    <w:p/>
+    <w:p>
+      <w:r>
+        <w:t xml:space="preserve">    </w:t>
+      </w:r>
+    </w:p>
+    <w:p>
+      <w:r>
+        <w:t>def get_available_holes_for_part(part):</w:t>
+      </w:r>
+    </w:p>
+    <w:p>
+      <w:r>
+        <w:t xml:space="preserve">    """Return hole list depending on part type."""</w:t>
+      </w:r>
+    </w:p>
+    <w:p>
+      <w:r>
+        <w:t xml:space="preserve">    if part.lower() == "mixing block":</w:t>
+      </w:r>
+    </w:p>
+    <w:p>
+      <w:r>
+        <w:t xml:space="preserve">        return ["1", "2", "3", "4"]</w:t>
+      </w:r>
+    </w:p>
+    <w:p>
+      <w:r>
+        <w:t xml:space="preserve">    elif part.lower() in ["gas/water block", "gas-water block", "gas water block"]:</w:t>
+      </w:r>
+    </w:p>
+    <w:p>
+      <w:r>
+        <w:t xml:space="preserve">        return ["1", "2", "3", "4", "5"]</w:t>
+      </w:r>
+    </w:p>
+    <w:p>
+      <w:r>
+        <w:t xml:space="preserve">    else:</w:t>
+      </w:r>
+    </w:p>
+    <w:p>
+      <w:r>
+        <w:t xml:space="preserve">        return ["1"]</w:t>
+      </w:r>
+    </w:p>
+    <w:p/>
+    <w:p/>
+    <w:p>
+      <w:r>
+        <w:t>def get_features_for_part(part, hole):</w:t>
+      </w:r>
+    </w:p>
+    <w:p>
+      <w:r>
+        <w:t xml:space="preserve">    if part == "Mixing Block":</w:t>
+      </w:r>
+    </w:p>
+    <w:p>
+      <w:r>
+        <w:t xml:space="preserve">        return ["Inner", "Outer"]</w:t>
+      </w:r>
+    </w:p>
+    <w:p>
+      <w:r>
+        <w:t xml:space="preserve">    else:</w:t>
+      </w:r>
+    </w:p>
+    <w:p>
+      <w:r>
+        <w:t xml:space="preserve">        return ["Inner"]</w:t>
+      </w:r>
+    </w:p>
+    <w:p/>
+    <w:p>
+      <w:r>
+        <w:t># ---------------- SAFE HOLE SORT KEY ----------------</w:t>
+      </w:r>
+    </w:p>
+    <w:p>
+      <w:r>
+        <w:t>def safe_hole_sort_key(x):</w:t>
+      </w:r>
+    </w:p>
+    <w:p>
+      <w:r>
+        <w:t xml:space="preserve">    """</w:t>
+      </w:r>
+    </w:p>
+    <w:p>
+      <w:r>
+        <w:t xml:space="preserve">    Convert a hole identifier into an integer sort key.</w:t>
+      </w:r>
+    </w:p>
+    <w:p/>
+    <w:p>
+      <w:r>
+        <w:t xml:space="preserve">    Accepts values like:</w:t>
+      </w:r>
+    </w:p>
+    <w:p>
+      <w:r>
+        <w:t xml:space="preserve">      -  "1", "2", ...</w:t>
+      </w:r>
+    </w:p>
+    <w:p>
+      <w:r>
+        <w:t xml:space="preserve">      -  "H1", "H2"</w:t>
+      </w:r>
+    </w:p>
+    <w:p>
+      <w:r>
+        <w:t xml:space="preserve">      -  "H10"</w:t>
+      </w:r>
+    </w:p>
+    <w:p>
+      <w:r>
+        <w:t xml:space="preserve">      -  "meas_H1_Inner", "meas_H10_Outer", "someprefix_H3_suffix"</w:t>
+      </w:r>
+    </w:p>
+    <w:p>
+      <w:r>
+        <w:t xml:space="preserve">      -  other noisy strings containing a number</w:t>
+      </w:r>
+    </w:p>
+    <w:p/>
+    <w:p>
+      <w:r>
+        <w:t xml:space="preserve">    Returns:</w:t>
+      </w:r>
+    </w:p>
+    <w:p>
+      <w:r>
+        <w:t xml:space="preserve">      - integer hole number when found (so sorting is numeric)</w:t>
+      </w:r>
+    </w:p>
+    <w:p>
+      <w:r>
+        <w:t xml:space="preserve">      - 999 as a safe fallback for unknown values</w:t>
+      </w:r>
+    </w:p>
+    <w:p>
+      <w:r>
+        <w:t xml:space="preserve">    """</w:t>
+      </w:r>
+    </w:p>
+    <w:p>
+      <w:r>
+        <w:t xml:space="preserve">    try:</w:t>
+      </w:r>
+    </w:p>
+    <w:p>
+      <w:r>
+        <w:t xml:space="preserve">        s = str(x).strip()</w:t>
+      </w:r>
+    </w:p>
+    <w:p>
+      <w:r>
+        <w:t xml:space="preserve">    except Exception:</w:t>
+      </w:r>
+    </w:p>
+    <w:p>
+      <w:r>
         <w:lastRenderedPageBreak/>
-        <w:t xml:space="preserve">    elif alt:</w:t>
-      </w:r>
-    </w:p>
-    <w:p>
-      <w:r>
-        <w:t xml:space="preserve">        return False, f"Excel locked — saved clone to: {alt}"</w:t>
-      </w:r>
-    </w:p>
-    <w:p>
-      <w:r>
-        <w:t xml:space="preserve">    else:</w:t>
-      </w:r>
-    </w:p>
-    <w:p>
-      <w:r>
-        <w:t xml:space="preserve">        return False, "Failed to save measurements"</w:t>
-      </w:r>
-    </w:p>
-    <w:p/>
-    <w:p>
-      <w:r>
-        <w:t xml:space="preserve">    </w:t>
-      </w:r>
-    </w:p>
-    <w:p>
-      <w:r>
-        <w:t>def get_available_holes_for_part(part):</w:t>
-      </w:r>
-    </w:p>
-    <w:p>
-      <w:r>
-        <w:t xml:space="preserve">    """Return hole list depending on part type."""</w:t>
-      </w:r>
-    </w:p>
-    <w:p>
-      <w:r>
-        <w:t xml:space="preserve">    if part.lower() == "mixing block":</w:t>
-      </w:r>
-    </w:p>
-    <w:p>
-      <w:r>
-        <w:t xml:space="preserve">        return ["1", "2", "3", "4"]</w:t>
-      </w:r>
-    </w:p>
-    <w:p>
-      <w:r>
-        <w:t xml:space="preserve">    elif part.lower() in ["gas/water block", "gas-water block", "gas water block"]:</w:t>
-      </w:r>
-    </w:p>
-    <w:p>
-      <w:r>
-        <w:t xml:space="preserve">        return ["1", "2", "3", "4", "5"]</w:t>
-      </w:r>
-    </w:p>
-    <w:p>
-      <w:r>
-        <w:t xml:space="preserve">    else:</w:t>
-      </w:r>
-    </w:p>
-    <w:p>
-      <w:r>
-        <w:t xml:space="preserve">        return ["1"]</w:t>
-      </w:r>
-    </w:p>
-    <w:p/>
-    <w:p/>
-    <w:p>
-      <w:r>
-        <w:t>def get_features_for_part(part, hole):</w:t>
-      </w:r>
-    </w:p>
-    <w:p>
-      <w:r>
-        <w:t xml:space="preserve">    if part == "Mixing Block":</w:t>
-      </w:r>
-    </w:p>
-    <w:p>
-      <w:r>
-        <w:t xml:space="preserve">        return ["Inner", "Outer"]</w:t>
-      </w:r>
-    </w:p>
-    <w:p>
-      <w:r>
-        <w:t xml:space="preserve">    else:</w:t>
-      </w:r>
-    </w:p>
-    <w:p>
-      <w:r>
-        <w:t xml:space="preserve">        return ["Inner"]</w:t>
-      </w:r>
-    </w:p>
-    <w:p/>
-    <w:p>
-      <w:r>
-        <w:t># ---------------- SAFE HOLE SORT KEY ----------------</w:t>
-      </w:r>
-    </w:p>
-    <w:p>
-      <w:r>
-        <w:t>def safe_hole_sort_key(x):</w:t>
-      </w:r>
-    </w:p>
-    <w:p>
-      <w:r>
-        <w:t xml:space="preserve">    """</w:t>
-      </w:r>
-    </w:p>
-    <w:p>
-      <w:r>
-        <w:t xml:space="preserve">    Convert a hole identifier into an integer sort key.</w:t>
-      </w:r>
-    </w:p>
-    <w:p/>
-    <w:p>
-      <w:r>
-        <w:t xml:space="preserve">    Accepts values like:</w:t>
-      </w:r>
-    </w:p>
-    <w:p>
-      <w:r>
-        <w:t xml:space="preserve">      -  "1", "2", ...</w:t>
-      </w:r>
-    </w:p>
-    <w:p>
-      <w:r>
-        <w:t xml:space="preserve">      -  "H1", "H2"</w:t>
-      </w:r>
-    </w:p>
-    <w:p>
-      <w:r>
-        <w:t xml:space="preserve">      -  "H10"</w:t>
-      </w:r>
-    </w:p>
-    <w:p>
-      <w:r>
-        <w:t xml:space="preserve">      -  "meas_H1_Inner", "meas_H10_Outer", "someprefix_H3_suffix"</w:t>
-      </w:r>
-    </w:p>
-    <w:p>
-      <w:r>
-        <w:t xml:space="preserve">      -  other noisy strings containing a number</w:t>
-      </w:r>
-    </w:p>
-    <w:p/>
-    <w:p>
-      <w:r>
-        <w:t xml:space="preserve">    Returns:</w:t>
-      </w:r>
-    </w:p>
-    <w:p>
-      <w:r>
-        <w:t xml:space="preserve">      - integer hole number when found (so sorting is numeric)</w:t>
-      </w:r>
-    </w:p>
-    <w:p>
-      <w:r>
-        <w:t xml:space="preserve">      - 999 as a safe fallback for unknown values</w:t>
-      </w:r>
-    </w:p>
-    <w:p>
-      <w:r>
-        <w:t xml:space="preserve">    """</w:t>
-      </w:r>
-    </w:p>
-    <w:p>
-      <w:r>
-        <w:t xml:space="preserve">    try:</w:t>
-      </w:r>
-    </w:p>
-    <w:p>
-      <w:r>
-        <w:t xml:space="preserve">        s = str(x).strip()</w:t>
-      </w:r>
-    </w:p>
-    <w:p>
-      <w:r>
-        <w:t xml:space="preserve">    except Exception:</w:t>
-      </w:r>
-    </w:p>
-    <w:p>
-      <w:r>
         <w:t xml:space="preserve">        return 999</w:t>
       </w:r>
     </w:p>
@@ -1852,70 +1898,70 @@
     </w:p>
     <w:p>
       <w:r>
+        <w:t xml:space="preserve">    import re</w:t>
+      </w:r>
+    </w:p>
+    <w:p>
+      <w:r>
+        <w:t xml:space="preserve">    m = re.search(r'(\d+)', s)</w:t>
+      </w:r>
+    </w:p>
+    <w:p>
+      <w:r>
+        <w:t xml:space="preserve">    if m:</w:t>
+      </w:r>
+    </w:p>
+    <w:p>
+      <w:r>
+        <w:t xml:space="preserve">        try:</w:t>
+      </w:r>
+    </w:p>
+    <w:p>
+      <w:r>
+        <w:t xml:space="preserve">            return int(m.group(1))</w:t>
+      </w:r>
+    </w:p>
+    <w:p>
+      <w:r>
+        <w:t xml:space="preserve">        except Exception:</w:t>
+      </w:r>
+    </w:p>
+    <w:p>
+      <w:r>
+        <w:t xml:space="preserve">            return 999</w:t>
+      </w:r>
+    </w:p>
+    <w:p/>
+    <w:p>
+      <w:r>
+        <w:t xml:space="preserve">    # fallback (unknown)</w:t>
+      </w:r>
+    </w:p>
+    <w:p>
+      <w:r>
+        <w:t xml:space="preserve">    return 999</w:t>
+      </w:r>
+    </w:p>
+    <w:p/>
+    <w:p/>
+    <w:p>
+      <w:r>
+        <w:t>def show_trend_df(part, machine=None, chamber=None, hole=None, feature=None):</w:t>
+      </w:r>
+    </w:p>
+    <w:p>
+      <w:r>
+        <w:t xml:space="preserve">    df = read_sheet_safe(SHEET_MB if part == "Mixing Block" else SHEET_GW)</w:t>
+      </w:r>
+    </w:p>
+    <w:p>
+      <w:r>
+        <w:t xml:space="preserve">    if df is None or df.empty:</w:t>
+      </w:r>
+    </w:p>
+    <w:p>
+      <w:r>
         <w:lastRenderedPageBreak/>
-        <w:t xml:space="preserve">    import re</w:t>
-      </w:r>
-    </w:p>
-    <w:p>
-      <w:r>
-        <w:t xml:space="preserve">    m = re.search(r'(\d+)', s)</w:t>
-      </w:r>
-    </w:p>
-    <w:p>
-      <w:r>
-        <w:t xml:space="preserve">    if m:</w:t>
-      </w:r>
-    </w:p>
-    <w:p>
-      <w:r>
-        <w:t xml:space="preserve">        try:</w:t>
-      </w:r>
-    </w:p>
-    <w:p>
-      <w:r>
-        <w:t xml:space="preserve">            return int(m.group(1))</w:t>
-      </w:r>
-    </w:p>
-    <w:p>
-      <w:r>
-        <w:t xml:space="preserve">        except Exception:</w:t>
-      </w:r>
-    </w:p>
-    <w:p>
-      <w:r>
-        <w:t xml:space="preserve">            return 999</w:t>
-      </w:r>
-    </w:p>
-    <w:p/>
-    <w:p>
-      <w:r>
-        <w:t xml:space="preserve">    # fallback (unknown)</w:t>
-      </w:r>
-    </w:p>
-    <w:p>
-      <w:r>
-        <w:t xml:space="preserve">    return 999</w:t>
-      </w:r>
-    </w:p>
-    <w:p/>
-    <w:p/>
-    <w:p>
-      <w:r>
-        <w:t>def show_trend_df(part, machine=None, chamber=None, hole=None, feature=None):</w:t>
-      </w:r>
-    </w:p>
-    <w:p>
-      <w:r>
-        <w:t xml:space="preserve">    df = read_sheet_safe(SHEET_MB if part == "Mixing Block" else SHEET_GW)</w:t>
-      </w:r>
-    </w:p>
-    <w:p>
-      <w:r>
-        <w:t xml:space="preserve">    if df is None or df.empty:</w:t>
-      </w:r>
-    </w:p>
-    <w:p>
-      <w:r>
         <w:t xml:space="preserve">        return pd.DataFrame()</w:t>
       </w:r>
     </w:p>
@@ -1971,7 +2017,6 @@
     </w:p>
     <w:p>
       <w:r>
-        <w:lastRenderedPageBreak/>
         <w:t xml:space="preserve">    try: df["Timestamp"] = pd.to_datetime(df["Timestamp"])</w:t>
       </w:r>
     </w:p>
@@ -2079,6 +2124,7 @@
     <w:p/>
     <w:p>
       <w:r>
+        <w:lastRenderedPageBreak/>
         <w:t xml:space="preserve">    import streamlit as st</w:t>
       </w:r>
     </w:p>
@@ -2197,6 +2243,7 @@
     </w:p>
     <w:p>
       <w:r>
+        <w:lastRenderedPageBreak/>
         <w:t xml:space="preserve">            try:</w:t>
       </w:r>
     </w:p>
@@ -2240,74 +2287,74 @@
     <w:p/>
     <w:p>
       <w:r>
+        <w:t xml:space="preserve">    # --- Validate index bounds ---</w:t>
+      </w:r>
+    </w:p>
+    <w:p>
+      <w:r>
+        <w:t xml:space="preserve">    valid_indexes = [i for i in indexes if 0 &lt;= i &lt; n]</w:t>
+      </w:r>
+    </w:p>
+    <w:p>
+      <w:r>
+        <w:t xml:space="preserve">    if not valid_indexes:</w:t>
+      </w:r>
+    </w:p>
+    <w:p>
+      <w:r>
+        <w:t xml:space="preserve">        return False, f"No valid rows found. Valid range: 0–{n-1}"</w:t>
+      </w:r>
+    </w:p>
+    <w:p/>
+    <w:p>
+      <w:r>
+        <w:t xml:space="preserve">    # --- Drop rows correctly ---</w:t>
+      </w:r>
+    </w:p>
+    <w:p>
+      <w:r>
+        <w:t xml:space="preserve">    try:</w:t>
+      </w:r>
+    </w:p>
+    <w:p>
+      <w:r>
+        <w:t xml:space="preserve">        df_after = df.drop(index=valid_indexes, errors="ignore").reset_index(drop=True)</w:t>
+      </w:r>
+    </w:p>
+    <w:p>
+      <w:r>
+        <w:t xml:space="preserve">    except Exception as e:</w:t>
+      </w:r>
+    </w:p>
+    <w:p>
+      <w:r>
+        <w:t xml:space="preserve">        return False, f"Error deleting rows: {e}"</w:t>
+      </w:r>
+    </w:p>
+    <w:p/>
+    <w:p>
+      <w:r>
+        <w:t xml:space="preserve">    # --- Save back to Excel ---</w:t>
+      </w:r>
+    </w:p>
+    <w:p>
+      <w:r>
+        <w:t xml:space="preserve">    try:</w:t>
+      </w:r>
+    </w:p>
+    <w:p>
+      <w:r>
+        <w:t xml:space="preserve">        other_sheet = SHEET_GW if part == "Mixing Block" else SHEET_MB</w:t>
+      </w:r>
+    </w:p>
+    <w:p>
+      <w:r>
+        <w:t xml:space="preserve">        df_other = read_sheet_safe(other_sheet)</w:t>
+      </w:r>
+    </w:p>
+    <w:p>
+      <w:r>
         <w:lastRenderedPageBreak/>
-        <w:t xml:space="preserve">    # --- Validate index bounds ---</w:t>
-      </w:r>
-    </w:p>
-    <w:p>
-      <w:r>
-        <w:t xml:space="preserve">    valid_indexes = [i for i in indexes if 0 &lt;= i &lt; n]</w:t>
-      </w:r>
-    </w:p>
-    <w:p>
-      <w:r>
-        <w:t xml:space="preserve">    if not valid_indexes:</w:t>
-      </w:r>
-    </w:p>
-    <w:p>
-      <w:r>
-        <w:t xml:space="preserve">        return False, f"No valid rows found. Valid range: 0–{n-1}"</w:t>
-      </w:r>
-    </w:p>
-    <w:p/>
-    <w:p>
-      <w:r>
-        <w:t xml:space="preserve">    # --- Drop rows correctly ---</w:t>
-      </w:r>
-    </w:p>
-    <w:p>
-      <w:r>
-        <w:t xml:space="preserve">    try:</w:t>
-      </w:r>
-    </w:p>
-    <w:p>
-      <w:r>
-        <w:t xml:space="preserve">        df_after = df.drop(index=valid_indexes, errors="ignore").reset_index(drop=True)</w:t>
-      </w:r>
-    </w:p>
-    <w:p>
-      <w:r>
-        <w:t xml:space="preserve">    except Exception as e:</w:t>
-      </w:r>
-    </w:p>
-    <w:p>
-      <w:r>
-        <w:t xml:space="preserve">        return False, f"Error deleting rows: {e}"</w:t>
-      </w:r>
-    </w:p>
-    <w:p/>
-    <w:p>
-      <w:r>
-        <w:t xml:space="preserve">    # --- Save back to Excel ---</w:t>
-      </w:r>
-    </w:p>
-    <w:p>
-      <w:r>
-        <w:t xml:space="preserve">    try:</w:t>
-      </w:r>
-    </w:p>
-    <w:p>
-      <w:r>
-        <w:t xml:space="preserve">        other_sheet = SHEET_GW if part == "Mixing Block" else SHEET_MB</w:t>
-      </w:r>
-    </w:p>
-    <w:p>
-      <w:r>
-        <w:t xml:space="preserve">        df_other = read_sheet_safe(other_sheet)</w:t>
-      </w:r>
-    </w:p>
-    <w:p>
-      <w:r>
         <w:t xml:space="preserve">        specs_df = read_sheet_safe(SHEET_SPECS)</w:t>
       </w:r>
     </w:p>
@@ -2355,7 +2402,6 @@
     </w:p>
     <w:p>
       <w:r>
-        <w:lastRenderedPageBreak/>
         <w:t xml:space="preserve">                apply_excel_coloring_and_separator([SHEET_MB, SHEET_GW])</w:t>
       </w:r>
     </w:p>
@@ -2445,6 +2491,7 @@
     </w:p>
     <w:p>
       <w:r>
+        <w:lastRenderedPageBreak/>
         <w:t xml:space="preserve">                st.warning("</w:t>
       </w:r>
       <w:r>
@@ -2564,6 +2611,7 @@
     </w:p>
     <w:p>
       <w:r>
+        <w:lastRenderedPageBreak/>
         <w:t xml:space="preserve">            return False, f"Cannot open: {e}"</w:t>
       </w:r>
     </w:p>
@@ -2616,7 +2664,6 @@
     </w:p>
     <w:p>
       <w:r>
-        <w:lastRenderedPageBreak/>
         <w:t xml:space="preserve">    import streamlit as st</w:t>
       </w:r>
     </w:p>
@@ -2684,6 +2731,7 @@
     </w:p>
     <w:p>
       <w:r>
+        <w:lastRenderedPageBreak/>
         <w:t xml:space="preserve">    image_map = {</w:t>
       </w:r>
     </w:p>
@@ -2740,60 +2788,60 @@
     <w:p/>
     <w:p>
       <w:r>
+        <w:t xml:space="preserve">    # --- Step 3: Define view options ---</w:t>
+      </w:r>
+    </w:p>
+    <w:p>
+      <w:r>
+        <w:t xml:space="preserve">    view_options = list(image_map[part_type].keys()) + ["All Views (Side by Side)"]</w:t>
+      </w:r>
+    </w:p>
+    <w:p>
+      <w:r>
+        <w:t xml:space="preserve">    selected_view = st.selectbox("Select View:", view_options)</w:t>
+      </w:r>
+    </w:p>
+    <w:p/>
+    <w:p>
+      <w:r>
+        <w:t xml:space="preserve">    st.markdown("&lt;hr&gt;", unsafe_allow_html=True)</w:t>
+      </w:r>
+    </w:p>
+    <w:p/>
+    <w:p>
+      <w:r>
+        <w:t xml:space="preserve">    # --- Step 4: Display Logic ---</w:t>
+      </w:r>
+    </w:p>
+    <w:p>
+      <w:r>
+        <w:t xml:space="preserve">    if selected_view == "All Views (Side by Side)":</w:t>
+      </w:r>
+    </w:p>
+    <w:p>
+      <w:r>
+        <w:t xml:space="preserve">        st.markdown(f"&lt;h4 style='text-align:center;'&gt;{part_type} — All Views&lt;/h4&gt;", unsafe_allow_html=True)</w:t>
+      </w:r>
+    </w:p>
+    <w:p>
+      <w:r>
+        <w:t xml:space="preserve">        views = list(image_map[part_type].keys())</w:t>
+      </w:r>
+    </w:p>
+    <w:p>
+      <w:r>
+        <w:t xml:space="preserve">        num_cols = min(3, len(views))</w:t>
+      </w:r>
+    </w:p>
+    <w:p>
+      <w:r>
+        <w:t xml:space="preserve">        cols = st.columns(num_cols, gap="medium")</w:t>
+      </w:r>
+    </w:p>
+    <w:p/>
+    <w:p>
+      <w:r>
         <w:lastRenderedPageBreak/>
-        <w:t xml:space="preserve">    # --- Step 3: Define view options ---</w:t>
-      </w:r>
-    </w:p>
-    <w:p>
-      <w:r>
-        <w:t xml:space="preserve">    view_options = list(image_map[part_type].keys()) + ["All Views (Side by Side)"]</w:t>
-      </w:r>
-    </w:p>
-    <w:p>
-      <w:r>
-        <w:t xml:space="preserve">    selected_view = st.selectbox("Select View:", view_options)</w:t>
-      </w:r>
-    </w:p>
-    <w:p/>
-    <w:p>
-      <w:r>
-        <w:t xml:space="preserve">    st.markdown("&lt;hr&gt;", unsafe_allow_html=True)</w:t>
-      </w:r>
-    </w:p>
-    <w:p/>
-    <w:p>
-      <w:r>
-        <w:t xml:space="preserve">    # --- Step 4: Display Logic ---</w:t>
-      </w:r>
-    </w:p>
-    <w:p>
-      <w:r>
-        <w:t xml:space="preserve">    if selected_view == "All Views (Side by Side)":</w:t>
-      </w:r>
-    </w:p>
-    <w:p>
-      <w:r>
-        <w:t xml:space="preserve">        st.markdown(f"&lt;h4 style='text-align:center;'&gt;{part_type} — All Views&lt;/h4&gt;", unsafe_allow_html=True)</w:t>
-      </w:r>
-    </w:p>
-    <w:p>
-      <w:r>
-        <w:t xml:space="preserve">        views = list(image_map[part_type].keys())</w:t>
-      </w:r>
-    </w:p>
-    <w:p>
-      <w:r>
-        <w:t xml:space="preserve">        num_cols = min(3, len(views))</w:t>
-      </w:r>
-    </w:p>
-    <w:p>
-      <w:r>
-        <w:t xml:space="preserve">        cols = st.columns(num_cols, gap="medium")</w:t>
-      </w:r>
-    </w:p>
-    <w:p/>
-    <w:p>
-      <w:r>
         <w:t xml:space="preserve">        for i, view in enumerate(views):</w:t>
       </w:r>
     </w:p>
@@ -2855,7 +2903,6 @@
     <w:p/>
     <w:p>
       <w:r>
-        <w:lastRenderedPageBreak/>
         <w:t xml:space="preserve">                img_bytes = open(img_path, "rb").read()</w:t>
       </w:r>
     </w:p>
@@ -2931,6 +2978,7 @@
     </w:p>
     <w:p>
       <w:r>
+        <w:lastRenderedPageBreak/>
         <w:t xml:space="preserve">                    unsafe_allow_html=True</w:t>
       </w:r>
     </w:p>
@@ -2992,73 +3040,73 @@
     </w:p>
     <w:p>
       <w:r>
+        <w:t xml:space="preserve">                ratio = max_width / img.width</w:t>
+      </w:r>
+    </w:p>
+    <w:p>
+      <w:r>
+        <w:t xml:space="preserve">                new_height = int(img.height * ratio)</w:t>
+      </w:r>
+    </w:p>
+    <w:p>
+      <w:r>
+        <w:t xml:space="preserve">                img = img.resize((max_width, new_height))</w:t>
+      </w:r>
+    </w:p>
+    <w:p>
+      <w:r>
+        <w:t xml:space="preserve">                img_bytes = open(img_file, "rb").read()</w:t>
+      </w:r>
+    </w:p>
+    <w:p>
+      <w:r>
+        <w:t xml:space="preserve">                img_base64 = base64.b64encode(img_bytes).decode()</w:t>
+      </w:r>
+    </w:p>
+    <w:p/>
+    <w:p>
+      <w:r>
+        <w:t xml:space="preserve">                st.markdown(</w:t>
+      </w:r>
+    </w:p>
+    <w:p>
+      <w:r>
+        <w:t xml:space="preserve">                    f"""</w:t>
+      </w:r>
+    </w:p>
+    <w:p>
+      <w:r>
+        <w:t xml:space="preserve">                    &lt;div style="text-align:center;"&gt;</w:t>
+      </w:r>
+    </w:p>
+    <w:p>
+      <w:r>
+        <w:t xml:space="preserve">                        &lt;img src="data:image/png;base64,{img_base64}" </w:t>
+      </w:r>
+    </w:p>
+    <w:p>
+      <w:r>
+        <w:t xml:space="preserve">                             style="width:{max_width}px; height:auto; border-radius:10px; </w:t>
+      </w:r>
+    </w:p>
+    <w:p>
+      <w:r>
+        <w:t xml:space="preserve">                             box-shadow:0px 4px 10px rgba(0,0,0,0.3);" /&gt;</w:t>
+      </w:r>
+    </w:p>
+    <w:p>
+      <w:r>
+        <w:t xml:space="preserve">                        &lt;p style="font-style:italic; color:gray;"&gt;{part_type} — {selected_view}&lt;/p&gt;</w:t>
+      </w:r>
+    </w:p>
+    <w:p>
+      <w:r>
+        <w:t xml:space="preserve">                    &lt;/div&gt;</w:t>
+      </w:r>
+    </w:p>
+    <w:p>
+      <w:r>
         <w:lastRenderedPageBreak/>
-        <w:t xml:space="preserve">                ratio = max_width / img.width</w:t>
-      </w:r>
-    </w:p>
-    <w:p>
-      <w:r>
-        <w:t xml:space="preserve">                new_height = int(img.height * ratio)</w:t>
-      </w:r>
-    </w:p>
-    <w:p>
-      <w:r>
-        <w:t xml:space="preserve">                img = img.resize((max_width, new_height))</w:t>
-      </w:r>
-    </w:p>
-    <w:p>
-      <w:r>
-        <w:t xml:space="preserve">                img_bytes = open(img_file, "rb").read()</w:t>
-      </w:r>
-    </w:p>
-    <w:p>
-      <w:r>
-        <w:t xml:space="preserve">                img_base64 = base64.b64encode(img_bytes).decode()</w:t>
-      </w:r>
-    </w:p>
-    <w:p/>
-    <w:p>
-      <w:r>
-        <w:t xml:space="preserve">                st.markdown(</w:t>
-      </w:r>
-    </w:p>
-    <w:p>
-      <w:r>
-        <w:t xml:space="preserve">                    f"""</w:t>
-      </w:r>
-    </w:p>
-    <w:p>
-      <w:r>
-        <w:t xml:space="preserve">                    &lt;div style="text-align:center;"&gt;</w:t>
-      </w:r>
-    </w:p>
-    <w:p>
-      <w:r>
-        <w:t xml:space="preserve">                        &lt;img src="data:image/png;base64,{img_base64}" </w:t>
-      </w:r>
-    </w:p>
-    <w:p>
-      <w:r>
-        <w:t xml:space="preserve">                             style="width:{max_width}px; height:auto; border-radius:10px; </w:t>
-      </w:r>
-    </w:p>
-    <w:p>
-      <w:r>
-        <w:t xml:space="preserve">                             box-shadow:0px 4px 10px rgba(0,0,0,0.3);" /&gt;</w:t>
-      </w:r>
-    </w:p>
-    <w:p>
-      <w:r>
-        <w:t xml:space="preserve">                        &lt;p style="font-style:italic; color:gray;"&gt;{part_type} — {selected_view}&lt;/p&gt;</w:t>
-      </w:r>
-    </w:p>
-    <w:p>
-      <w:r>
-        <w:t xml:space="preserve">                    &lt;/div&gt;</w:t>
-      </w:r>
-    </w:p>
-    <w:p>
-      <w:r>
         <w:t xml:space="preserve">                    """,</w:t>
       </w:r>
     </w:p>
@@ -3120,7 +3168,6 @@
     </w:p>
     <w:p>
       <w:r>
-        <w:lastRenderedPageBreak/>
         <w:t xml:space="preserve">    st.markdown("### </w:t>
       </w:r>
       <w:r>
@@ -3200,6 +3247,7 @@
     </w:p>
     <w:p>
       <w:r>
+        <w:lastRenderedPageBreak/>
         <w:t xml:space="preserve">    st.markdown("### </w:t>
       </w:r>
       <w:r>
@@ -3264,7 +3312,6 @@
     </w:p>
     <w:p>
       <w:r>
-        <w:lastRenderedPageBreak/>
         <w:t xml:space="preserve">            )</w:t>
       </w:r>
     </w:p>
@@ -3328,6 +3375,7 @@
     </w:p>
     <w:p>
       <w:r>
+        <w:lastRenderedPageBreak/>
         <w:t xml:space="preserve">    for v in y:</w:t>
       </w:r>
     </w:p>
@@ -3380,65 +3428,65 @@
     </w:p>
     <w:p>
       <w:r>
+        <w:t xml:space="preserve">    if spec_min is not None:</w:t>
+      </w:r>
+    </w:p>
+    <w:p>
+      <w:r>
+        <w:t xml:space="preserve">        ax.axhline(spec_min, linestyle="--", label="Min Spec", color="gray")</w:t>
+      </w:r>
+    </w:p>
+    <w:p>
+      <w:r>
+        <w:t xml:space="preserve">    if spec_max is not None:</w:t>
+      </w:r>
+    </w:p>
+    <w:p>
+      <w:r>
+        <w:t xml:space="preserve">        ax.axhline(spec_max, linestyle="--", label="Max Spec", color="gray")</w:t>
+      </w:r>
+    </w:p>
+    <w:p/>
+    <w:p>
+      <w:r>
+        <w:t xml:space="preserve">    ax.set_title(title)</w:t>
+      </w:r>
+    </w:p>
+    <w:p>
+      <w:r>
+        <w:t xml:space="preserve">    ax.set_xlabel("Record #")</w:t>
+      </w:r>
+    </w:p>
+    <w:p>
+      <w:r>
+        <w:t xml:space="preserve">    ax.set_ylabel("Measurement (mm)")</w:t>
+      </w:r>
+    </w:p>
+    <w:p>
+      <w:r>
+        <w:t xml:space="preserve">    ax.legend()</w:t>
+      </w:r>
+    </w:p>
+    <w:p/>
+    <w:p>
+      <w:r>
+        <w:t xml:space="preserve">    st.pyplot(fig)</w:t>
+      </w:r>
+    </w:p>
+    <w:p/>
+    <w:p>
+      <w:r>
+        <w:t xml:space="preserve">    # Build analysis text</w:t>
+      </w:r>
+    </w:p>
+    <w:p>
+      <w:r>
+        <w:t xml:space="preserve">    issues = []</w:t>
+      </w:r>
+    </w:p>
+    <w:p>
+      <w:r>
         <w:lastRenderedPageBreak/>
-        <w:t xml:space="preserve">    if spec_min is not None:</w:t>
-      </w:r>
-    </w:p>
-    <w:p>
-      <w:r>
-        <w:t xml:space="preserve">        ax.axhline(spec_min, linestyle="--", label="Min Spec", color="gray")</w:t>
-      </w:r>
-    </w:p>
-    <w:p>
-      <w:r>
-        <w:t xml:space="preserve">    if spec_max is not None:</w:t>
-      </w:r>
-    </w:p>
-    <w:p>
-      <w:r>
-        <w:t xml:space="preserve">        ax.axhline(spec_max, linestyle="--", label="Max Spec", color="gray")</w:t>
-      </w:r>
-    </w:p>
-    <w:p/>
-    <w:p>
-      <w:r>
-        <w:t xml:space="preserve">    ax.set_title(title)</w:t>
-      </w:r>
-    </w:p>
-    <w:p>
-      <w:r>
-        <w:t xml:space="preserve">    ax.set_xlabel("Record #")</w:t>
-      </w:r>
-    </w:p>
-    <w:p>
-      <w:r>
-        <w:t xml:space="preserve">    ax.set_ylabel("Measurement (mm)")</w:t>
-      </w:r>
-    </w:p>
-    <w:p>
-      <w:r>
-        <w:t xml:space="preserve">    ax.legend()</w:t>
-      </w:r>
-    </w:p>
-    <w:p/>
-    <w:p>
-      <w:r>
-        <w:t xml:space="preserve">    st.pyplot(fig)</w:t>
-      </w:r>
-    </w:p>
-    <w:p/>
-    <w:p>
-      <w:r>
-        <w:t xml:space="preserve">    # Build analysis text</w:t>
-      </w:r>
-    </w:p>
-    <w:p>
-      <w:r>
-        <w:t xml:space="preserve">    issues = []</w:t>
-      </w:r>
-    </w:p>
-    <w:p>
-      <w:r>
         <w:t xml:space="preserve">    for idx, v in enumerate(y):</w:t>
       </w:r>
     </w:p>

</xml_diff>